<commit_message>
feat: implement lesson 25.2 materials, presentation assets, and tsunami reading CSS layout
</commit_message>
<xml_diff>
--- a/Units/English/English_Unit_2/Lesson_Plans/Lesson_25.2/Lesson Plan 25.2 Magazine Reading Year 3/Lesson_Plan_25.2_Magazine_Reading_Y3.docx
+++ b/Units/English/English_Unit_2/Lesson_Plans/Lesson_25.2/Lesson Plan 25.2 Magazine Reading Year 3/Lesson_Plan_25.2_Magazine_Reading_Y3.docx
@@ -1,6 +1,6 @@
 
 <file path=word/document.xml><?xml version="1.0" encoding="utf-8"?>
-<w:document xmlns:wpc="http://schemas.microsoft.com/office/word/2010/wordprocessingCanvas" xmlns:mc="http://schemas.openxmlformats.org/markup-compatibility/2006" xmlns:o="urn:schemas-microsoft-com:office:office" xmlns:r="http://schemas.openxmlformats.org/officeDocument/2006/relationships" xmlns:m="http://schemas.openxmlformats.org/officeDocument/2006/math" xmlns:v="urn:schemas-microsoft-com:vml" xmlns:wp14="http://schemas.microsoft.com/office/word/2010/wordprocessingDrawing" xmlns:wp="http://schemas.openxmlformats.org/drawingml/2006/wordprocessingDrawing" xmlns:w10="urn:schemas-microsoft-com:office:word" xmlns:w="http://schemas.openxmlformats.org/wordprocessingml/2006/main" xmlns:w14="http://schemas.microsoft.com/office/word/2010/wordml" xmlns:w15="http://schemas.microsoft.com/office/word/2012/wordml" xmlns:wpg="http://schemas.microsoft.com/office/word/2010/wordprocessingGroup" xmlns:wpi="http://schemas.microsoft.com/office/word/2010/wordprocessingInk" xmlns:wne="http://schemas.microsoft.com/office/word/2006/wordml" xmlns:wps="http://schemas.microsoft.com/office/word/2010/wordprocessingShape" xmlns:cx="http://schemas.microsoft.com/office/drawing/2014/chartex" xmlns:cx1="http://schemas.microsoft.com/office/drawing/2015/9/8/chartex" xmlns:cx2="http://schemas.microsoft.com/office/drawing/2015/10/21/chartex" xmlns:cx3="http://schemas.microsoft.com/office/drawing/2016/5/9/chartex" xmlns:cx4="http://schemas.microsoft.com/office/drawing/2016/5/10/chartex" xmlns:cx5="http://schemas.microsoft.com/office/drawing/2016/5/11/chartex" xmlns:cx6="http://schemas.microsoft.com/office/drawing/2016/5/12/chartex" xmlns:cx7="http://schemas.microsoft.com/office/drawing/2016/5/13/chartex" xmlns:cx8="http://schemas.microsoft.com/office/drawing/2016/5/14/chartex" xmlns:aink="http://schemas.microsoft.com/office/drawing/2016/ink" xmlns:am3d="http://schemas.microsoft.com/office/drawing/2017/model3d" xmlns:w16cex="http://schemas.microsoft.com/office/word/2018/wordml/cex" xmlns:w16cid="http://schemas.microsoft.com/office/word/2016/wordml/cid" xmlns:w16="http://schemas.microsoft.com/office/word/2018/wordml" xmlns:w16sdtdh="http://schemas.microsoft.com/office/word/2020/wordml/sdtdatahash" xmlns:w16se="http://schemas.microsoft.com/office/word/2015/wordml/symex" mc:Ignorable="w14 w15 wp14">
+<w:document xmlns:wpc="http://schemas.microsoft.com/office/word/2010/wordprocessingCanvas" xmlns:cx="http://schemas.microsoft.com/office/drawing/2014/chartex" xmlns:cx1="http://schemas.microsoft.com/office/drawing/2015/9/8/chartex" xmlns:cx2="http://schemas.microsoft.com/office/drawing/2015/10/21/chartex" xmlns:cx3="http://schemas.microsoft.com/office/drawing/2016/5/9/chartex" xmlns:cx4="http://schemas.microsoft.com/office/drawing/2016/5/10/chartex" xmlns:cx5="http://schemas.microsoft.com/office/drawing/2016/5/11/chartex" xmlns:cx6="http://schemas.microsoft.com/office/drawing/2016/5/12/chartex" xmlns:cx7="http://schemas.microsoft.com/office/drawing/2016/5/13/chartex" xmlns:cx8="http://schemas.microsoft.com/office/drawing/2016/5/14/chartex" xmlns:mc="http://schemas.openxmlformats.org/markup-compatibility/2006" xmlns:aink="http://schemas.microsoft.com/office/drawing/2016/ink" xmlns:am3d="http://schemas.microsoft.com/office/drawing/2017/model3d" xmlns:o="urn:schemas-microsoft-com:office:office" xmlns:oel="http://schemas.microsoft.com/office/2019/extlst" xmlns:r="http://schemas.openxmlformats.org/officeDocument/2006/relationships" xmlns:m="http://schemas.openxmlformats.org/officeDocument/2006/math" xmlns:v="urn:schemas-microsoft-com:vml" xmlns:wp14="http://schemas.microsoft.com/office/word/2010/wordprocessingDrawing" xmlns:wp="http://schemas.openxmlformats.org/drawingml/2006/wordprocessingDrawing" xmlns:w10="urn:schemas-microsoft-com:office:word" xmlns:w="http://schemas.openxmlformats.org/wordprocessingml/2006/main" xmlns:w14="http://schemas.microsoft.com/office/word/2010/wordml" xmlns:w15="http://schemas.microsoft.com/office/word/2012/wordml" xmlns:w16cex="http://schemas.microsoft.com/office/word/2018/wordml/cex" xmlns:w16cid="http://schemas.microsoft.com/office/word/2016/wordml/cid" xmlns:w16="http://schemas.microsoft.com/office/word/2018/wordml" xmlns:w16du="http://schemas.microsoft.com/office/word/2023/wordml/word16du" xmlns:w16sdtdh="http://schemas.microsoft.com/office/word/2020/wordml/sdtdatahash" xmlns:w16sdtfl="http://schemas.microsoft.com/office/word/2024/wordml/sdtformatlock" xmlns:w16se="http://schemas.microsoft.com/office/word/2015/wordml/symex" xmlns:wpg="http://schemas.microsoft.com/office/word/2010/wordprocessingGroup" xmlns:wpi="http://schemas.microsoft.com/office/word/2010/wordprocessingInk" xmlns:wne="http://schemas.microsoft.com/office/word/2006/wordml" xmlns:wps="http://schemas.microsoft.com/office/word/2010/wordprocessingShape" mc:Ignorable="w14 w15 w16se w16cid w16 w16cex w16sdtdh w16sdtfl w16du wp14">
   <w:body>
     <w:p>
       <w:pPr>
@@ -15,7 +15,7 @@
           <w:sz w:val="18"/>
           <w:szCs w:val="18"/>
         </w:rPr>
-        <w:t xml:space="preserve">EARTH SCIENCE SPECIAL FEATURE</w:t>
+        <w:t>EARTH SCIENCE SPECIAL FEATURE</w:t>
       </w:r>
     </w:p>
     <w:p>
@@ -27,57 +27,12 @@
         <w:rPr>
           <w:b/>
           <w:bCs/>
-          <w:color w:val="1E242B"/>
           <w:sz w:val="48"/>
           <w:szCs w:val="48"/>
         </w:rPr>
-        <w:t xml:space="preserve">The Shaking Earth: Causes of Earthquakes</w:t>
-      </w:r>
-    </w:p>
-    <w:p>
-      <w:pPr>
-        <w:spacing w:after="360"/>
-        <w:jc w:val="center"/>
-      </w:pPr>
-      <w:r>
-        <w:rPr>
-          <w:color w:val="57606A"/>
-          <w:sz w:val="18"/>
-          <w:szCs w:val="18"/>
-        </w:rPr>
-        <w:t xml:space="preserve">Unit 2 Reading Resource  ■  Year 3 Simplified Edition  ■  Lesson 25.2</w:t>
-      </w:r>
-    </w:p>
-    <w:tbl>
-      <w:tblPr>
-        <w:tblW w:type="auto" w:w="100"/>
-        <w:tblBorders>
-          <w:top w:val="single" w:color="auto" w:sz="4"/>
-          <w:left w:val="single" w:color="auto" w:sz="4"/>
-          <w:bottom w:val="single" w:color="auto" w:sz="4"/>
-          <w:right w:val="single" w:color="auto" w:sz="4"/>
-          <w:insideH w:val="single" w:color="auto" w:sz="4"/>
-          <w:insideV w:val="single" w:color="auto" w:sz="4"/>
-        </w:tblBorders>
-      </w:tblPr>
-      <w:tblGrid>
-        <w:gridCol w:w="9026"/>
-      </w:tblGrid>
-      <w:tr>
-        <w:tc>
-          <w:tcPr>
-            <w:tcW w:type="dxa" w:w="9026"/>
-            <w:tcBorders>
-              <w:top w:val="none"/>
-              <w:left w:val="none"/>
-              <w:bottom w:val="double" w:color="DCDBD7" w:sz="8"/>
-              <w:right w:val="none"/>
-            </w:tcBorders>
-          </w:tcPr>
-          <w:p/>
-        </w:tc>
-      </w:tr>
-    </w:tbl>
+        <w:t>The Shaking Earth: Causes of Earthquakes</w:t>
+      </w:r>
+    </w:p>
     <w:p>
       <w:pPr>
         <w:spacing w:before="240"/>
@@ -96,10 +51,18 @@
           <w:sz w:val="36"/>
           <w:szCs w:val="36"/>
         </w:rPr>
-        <w:t xml:space="preserve">T</w:t>
-      </w:r>
-      <w:r>
-        <w:t xml:space="preserve">he ground under our feet feels very solid. However, the outer layer of the Earth is actually broken into huge pieces. This outer layer is called the crust. The huge pieces are called tectonic plates. They are like giant puzzle pieces that make up the Earth's shell. Tectonic plates float very slowly on hot, melted rock deep inside the Earth. They move only a few centimetres every year.</w:t>
+        <w:t>T</w:t>
+      </w:r>
+      <w:r>
+        <w:t xml:space="preserve">he ground under our feet feels very solid. However, the outer layer of the Earth is </w:t>
+      </w:r>
+      <w:proofErr w:type="gramStart"/>
+      <w:r>
+        <w:t>actually broken</w:t>
+      </w:r>
+      <w:proofErr w:type="gramEnd"/>
+      <w:r>
+        <w:t xml:space="preserve"> into huge pieces. This outer layer is called the crust. The huge pieces are called tectonic plates. They are like giant puzzle pieces that make up the Earth's shell. Tectonic plates float very slowly on hot, melted rock deep inside the Earth. They move only a few centimetres every year.</w:t>
       </w:r>
     </w:p>
     <w:p>
@@ -108,19 +71,22 @@
         <w:jc w:val="both"/>
       </w:pPr>
       <w:r>
-        <w:t xml:space="preserve">As these plates float, they move in three main ways. First, some plates pull away from each other. Second, some plates bump into each other. This bumping can push the land up to make big mountains. Third, some plates slide sideways past each other. The places where the plates meet are called boundary zones.</w:t>
-      </w:r>
-    </w:p>
-    <w:p>
-      <w:pPr>
-        <w:spacing w:after="60" w:before="120"/>
+        <w:t>As these plates float, they move in three main ways. First, some plates pull away from each other. Second, some plates bump into each other. This bumping can push the land up to make big mountains. Third, some plates slide sideways past each other. The places where the plates meet are called boundary zones.</w:t>
+      </w:r>
+    </w:p>
+    <w:p>
+      <w:pPr>
+        <w:spacing w:before="120" w:after="60"/>
         <w:jc w:val="center"/>
       </w:pPr>
       <w:r>
+        <w:rPr>
+          <w:noProof/>
+        </w:rPr>
         <w:drawing>
-          <wp:inline distT="0" distB="0" distL="0" distR="0">
+          <wp:inline distT="0" distB="0" distL="0" distR="0" wp14:anchorId="25108416" wp14:editId="05A7F7AB">
             <wp:extent cx="4762500" cy="2667000"/>
-            <wp:effectExtent t="0" r="0" b="0" l="0"/>
+            <wp:effectExtent l="0" t="0" r="0" b="0"/>
             <wp:docPr id="1" name="PlateBoundaries" descr="Diagram showing plate movements" title="Tectonic Plate Boundaries"/>
             <wp:cNvGraphicFramePr>
               <a:graphicFrameLocks xmlns:a="http://schemas.openxmlformats.org/drawingml/2006/main" noChangeAspect="1"/>
@@ -129,13 +95,13 @@
               <a:graphicData uri="http://schemas.openxmlformats.org/drawingml/2006/picture">
                 <pic:pic xmlns:pic="http://schemas.openxmlformats.org/drawingml/2006/picture">
                   <pic:nvPicPr>
-                    <pic:cNvPr id="0" name="" descr=""/>
+                    <pic:cNvPr id="0" name=""/>
                     <pic:cNvPicPr>
                       <a:picLocks noChangeAspect="1" noChangeArrowheads="1"/>
                     </pic:cNvPicPr>
                   </pic:nvPicPr>
                   <pic:blipFill>
-                    <a:blip r:embed="rId7" cstate="none"/>
+                    <a:blip r:embed="rId5"/>
                     <a:srcRect/>
                     <a:stretch>
                       <a:fillRect/>
@@ -166,7 +132,6 @@
         <w:rPr>
           <w:b/>
           <w:bCs/>
-          <w:color w:val="1E242B"/>
           <w:sz w:val="16"/>
           <w:szCs w:val="16"/>
         </w:rPr>
@@ -178,7 +143,25 @@
           <w:sz w:val="16"/>
           <w:szCs w:val="16"/>
         </w:rPr>
-        <w:t xml:space="preserve">Tectonic plates floating on a softer, molten rock layer beneath Earth's outer crust. Arrows indicate the different ways plates interact: pulling apart, pushing together, or sliding sideways.</w:t>
+        <w:t xml:space="preserve">Tectonic plates floating on a softer, molten rock layer beneath Earth's outer crust. Arrows indicate the different ways plates </w:t>
+      </w:r>
+      <w:proofErr w:type="gramStart"/>
+      <w:r>
+        <w:rPr>
+          <w:color w:val="57606A"/>
+          <w:sz w:val="16"/>
+          <w:szCs w:val="16"/>
+        </w:rPr>
+        <w:t>interact:</w:t>
+      </w:r>
+      <w:proofErr w:type="gramEnd"/>
+      <w:r>
+        <w:rPr>
+          <w:color w:val="57606A"/>
+          <w:sz w:val="16"/>
+          <w:szCs w:val="16"/>
+        </w:rPr>
+        <w:t xml:space="preserve"> pulling apart, pushing together, or sliding sideways.</w:t>
       </w:r>
     </w:p>
     <w:p>
@@ -187,41 +170,40 @@
         <w:jc w:val="both"/>
       </w:pPr>
       <w:r>
-        <w:t xml:space="preserve">Tectonic plates have rough and jagged edges. As the plates try to move, their rough edges can get stuck. They stick because of friction. Friction is a force that stops things from sliding easily. Even though the edges are stuck, the rest of the plates keep moving. This creates tension. Tension is growing pressure stored in the stuck rocks.</w:t>
+        <w:t>Tectonic plates have rough and jagged edges. As the plates try to move, their rough edges can get stuck. They stick because of friction. Friction is a force that stops things from sliding easily. Even though the edges are stuck, the rest of the plates keep moving. This creates tension. Tension is growing pressure stored in the stuck rocks.</w:t>
       </w:r>
     </w:p>
     <w:tbl>
       <w:tblPr>
-        <w:tblW w:type="auto" w:w="100"/>
+        <w:tblW w:w="100" w:type="auto"/>
         <w:tblBorders>
-          <w:top w:val="single" w:color="auto" w:sz="4"/>
-          <w:left w:val="single" w:color="auto" w:sz="4"/>
-          <w:bottom w:val="single" w:color="auto" w:sz="4"/>
-          <w:right w:val="single" w:color="auto" w:sz="4"/>
-          <w:insideH w:val="single" w:color="auto" w:sz="4"/>
-          <w:insideV w:val="single" w:color="auto" w:sz="4"/>
+          <w:top w:val="single" w:sz="4" w:space="0" w:color="auto"/>
+          <w:left w:val="single" w:sz="4" w:space="0" w:color="auto"/>
+          <w:bottom w:val="single" w:sz="4" w:space="0" w:color="auto"/>
+          <w:right w:val="single" w:sz="4" w:space="0" w:color="auto"/>
+          <w:insideH w:val="single" w:sz="4" w:space="0" w:color="auto"/>
+          <w:insideV w:val="single" w:sz="4" w:space="0" w:color="auto"/>
         </w:tblBorders>
         <w:tblCellMar>
-          <w:top w:type="dxa" w:w="120"/>
-          <w:left w:type="dxa" w:w="240"/>
-          <w:bottom w:type="dxa" w:w="120"/>
-          <w:right w:type="dxa" w:w="240"/>
+          <w:top w:w="120" w:type="dxa"/>
+          <w:left w:w="240" w:type="dxa"/>
+          <w:bottom w:w="120" w:type="dxa"/>
+          <w:right w:w="240" w:type="dxa"/>
         </w:tblCellMar>
+        <w:tblLook w:val="04A0" w:firstRow="1" w:lastRow="0" w:firstColumn="1" w:lastColumn="0" w:noHBand="0" w:noVBand="1"/>
       </w:tblPr>
       <w:tblGrid>
-        <w:gridCol w:w="9026"/>
+        <w:gridCol w:w="9016"/>
       </w:tblGrid>
       <w:tr>
         <w:tc>
           <w:tcPr>
-            <w:tcW w:type="dxa" w:w="9026"/>
+            <w:tcW w:w="9026" w:type="dxa"/>
             <w:tcBorders>
-              <w:top w:val="single" w:color="C2410C" w:sz="12"/>
-              <w:left w:val="none"/>
-              <w:bottom w:val="single" w:color="C2410C" w:sz="12"/>
-              <w:right w:val="none"/>
+              <w:top w:val="single" w:sz="12" w:space="0" w:color="C2410C"/>
+              <w:bottom w:val="single" w:sz="12" w:space="0" w:color="C2410C"/>
             </w:tcBorders>
-            <w:shd w:fill="FAF9F5" w:val="clear"/>
+            <w:shd w:val="clear" w:color="auto" w:fill="FAF9F5"/>
           </w:tcPr>
           <w:p>
             <w:pPr>
@@ -237,7 +219,7 @@
                 <w:sz w:val="24"/>
                 <w:szCs w:val="24"/>
               </w:rPr>
-              <w:t xml:space="preserve">"Even though the edges are stuck, the rest of the plates keep moving... This creates tension."</w:t>
+              <w:t>"Even though the edges are stuck, the rest of the plates keep moving... This creates tension."</w:t>
             </w:r>
           </w:p>
           <w:p>
@@ -253,7 +235,7 @@
                 <w:sz w:val="14"/>
                 <w:szCs w:val="14"/>
               </w:rPr>
-              <w:t xml:space="preserve">— TECTONIC MECHANICS</w:t>
+              <w:t>— TECTONIC MECHANICS</w:t>
             </w:r>
           </w:p>
         </w:tc>
@@ -270,20 +252,24 @@
         <w:jc w:val="both"/>
       </w:pPr>
       <w:r>
-        <w:t xml:space="preserve">Over time, this pressure becomes too big. The rocks suddenly break or slip. This slip usually happens along a fault. A fault is a crack in the Earth's crust where rocks can move. When the rocks slip, they quickly release a lot of stored energy.</w:t>
-      </w:r>
-    </w:p>
-    <w:p>
-      <w:pPr>
-        <w:spacing w:after="60" w:before="120"/>
+        <w:t>Over time, this pressure becomes too big. The rocks suddenly break or slip. This slip usually happens along a fault. A fault is a crack in the Earth's crust where rocks can move. When the rocks slip, they quickly release a lot of stored energy.</w:t>
+      </w:r>
+    </w:p>
+    <w:p>
+      <w:pPr>
+        <w:spacing w:before="120" w:after="60"/>
         <w:jc w:val="center"/>
       </w:pPr>
       <w:r>
+        <w:rPr>
+          <w:noProof/>
+        </w:rPr>
+        <w:lastRenderedPageBreak/>
         <w:drawing>
-          <wp:inline distT="0" distB="0" distL="0" distR="0">
+          <wp:inline distT="0" distB="0" distL="0" distR="0" wp14:anchorId="17D50D07" wp14:editId="636177F8">
             <wp:extent cx="4762500" cy="3048000"/>
-            <wp:effectExtent t="0" r="0" b="0" l="0"/>
-            <wp:docPr id="1" name="EarthquakeDamage" descr="Photograph showing severe cracks in buildings and road" title="Earthquake Damage"/>
+            <wp:effectExtent l="0" t="0" r="0" b="0"/>
+            <wp:docPr id="1547340733" name="EarthquakeDamage" descr="Photograph showing severe cracks in buildings and road" title="Earthquake Damage"/>
             <wp:cNvGraphicFramePr>
               <a:graphicFrameLocks xmlns:a="http://schemas.openxmlformats.org/drawingml/2006/main" noChangeAspect="1"/>
             </wp:cNvGraphicFramePr>
@@ -291,13 +277,13 @@
               <a:graphicData uri="http://schemas.openxmlformats.org/drawingml/2006/picture">
                 <pic:pic xmlns:pic="http://schemas.openxmlformats.org/drawingml/2006/picture">
                   <pic:nvPicPr>
-                    <pic:cNvPr id="0" name="" descr=""/>
+                    <pic:cNvPr id="0" name=""/>
                     <pic:cNvPicPr>
                       <a:picLocks noChangeAspect="1" noChangeArrowheads="1"/>
                     </pic:cNvPicPr>
                   </pic:nvPicPr>
                   <pic:blipFill>
-                    <a:blip r:embed="rId8" cstate="none"/>
+                    <a:blip r:embed="rId6"/>
                     <a:srcRect/>
                     <a:stretch>
                       <a:fillRect/>
@@ -328,7 +314,6 @@
         <w:rPr>
           <w:b/>
           <w:bCs/>
-          <w:color w:val="1E242B"/>
           <w:sz w:val="16"/>
           <w:szCs w:val="16"/>
         </w:rPr>
@@ -340,7 +325,7 @@
           <w:sz w:val="16"/>
           <w:szCs w:val="16"/>
         </w:rPr>
-        <w:t xml:space="preserve">The aftermath of a historical earthquake, demonstrating how massive amounts of stored tension can fracture solid brickwork and split paved roads along active fault lines.</w:t>
+        <w:t>The aftermath of a historical earthquake, demonstrating how massive amounts of stored tension can fracture solid brickwork and split paved roads along active fault lines.</w:t>
       </w:r>
     </w:p>
     <w:p>
@@ -349,20 +334,23 @@
         <w:jc w:val="both"/>
       </w:pPr>
       <w:r>
-        <w:t xml:space="preserve">This energy travels out in all directions. It moves as seismic waves. Seismic waves are powerful ripples of energy that travel through the ground. These waves make the ground shake. We feel this shaking as an earthquake. The point deep underground where the rocks first broke is called the focus. The point on the surface directly above the focus is called the epicentre. The shaking is always strongest near the epicentre. Smaller shakes called aftershocks can happen for days or weeks after the main earthquake.</w:t>
-      </w:r>
-    </w:p>
-    <w:p>
-      <w:pPr>
-        <w:spacing w:after="60" w:before="120"/>
+        <w:t>This energy travels out in all directions. It moves as seismic waves. Seismic waves are powerful ripples of energy that travel through the ground. These waves make the ground shake. We feel this shaking as an earthquake. The point deep underground where the rocks first broke is called the focus. The point on the surface directly above the focus is called the epicentre. The shaking is always strongest near the epicentre. Smaller shakes called aftershocks can happen for days or weeks after the main earthquake.</w:t>
+      </w:r>
+    </w:p>
+    <w:p>
+      <w:pPr>
+        <w:spacing w:before="120" w:after="60"/>
         <w:jc w:val="center"/>
       </w:pPr>
       <w:r>
+        <w:rPr>
+          <w:noProof/>
+        </w:rPr>
         <w:drawing>
-          <wp:inline distT="0" distB="0" distL="0" distR="0">
+          <wp:inline distT="0" distB="0" distL="0" distR="0" wp14:anchorId="2D44484D" wp14:editId="2F967855">
             <wp:extent cx="4762500" cy="3048000"/>
-            <wp:effectExtent t="0" r="0" b="0" l="0"/>
-            <wp:docPr id="1" name="CrossSection" descr="Diagram showing focus, epicentre, fault, and seismic waves" title="Earthquake Cross-Section"/>
+            <wp:effectExtent l="0" t="0" r="0" b="0"/>
+            <wp:docPr id="313879812" name="CrossSection" descr="Diagram showing focus, epicentre, fault, and seismic waves" title="Earthquake Cross-Section"/>
             <wp:cNvGraphicFramePr>
               <a:graphicFrameLocks xmlns:a="http://schemas.openxmlformats.org/drawingml/2006/main" noChangeAspect="1"/>
             </wp:cNvGraphicFramePr>
@@ -370,13 +358,13 @@
               <a:graphicData uri="http://schemas.openxmlformats.org/drawingml/2006/picture">
                 <pic:pic xmlns:pic="http://schemas.openxmlformats.org/drawingml/2006/picture">
                   <pic:nvPicPr>
-                    <pic:cNvPr id="0" name="" descr=""/>
+                    <pic:cNvPr id="0" name=""/>
                     <pic:cNvPicPr>
                       <a:picLocks noChangeAspect="1" noChangeArrowheads="1"/>
                     </pic:cNvPicPr>
                   </pic:nvPicPr>
                   <pic:blipFill>
-                    <a:blip r:embed="rId9" cstate="none"/>
+                    <a:blip r:embed="rId7"/>
                     <a:srcRect/>
                     <a:stretch>
                       <a:fillRect/>
@@ -407,7 +395,6 @@
         <w:rPr>
           <w:b/>
           <w:bCs/>
-          <w:color w:val="1E242B"/>
           <w:sz w:val="16"/>
           <w:szCs w:val="16"/>
         </w:rPr>
@@ -419,7 +406,7 @@
           <w:sz w:val="16"/>
           <w:szCs w:val="16"/>
         </w:rPr>
-        <w:t xml:space="preserve">A cross-sectional view of an active earthquake zone, highlighting the focal point underground, the surface epicentre, and the propagating circular energy waves.</w:t>
+        <w:t>A cross-sectional view of an active earthquake zone, highlighting the focal point underground, the surface epicentre, and the propagating circular energy waves.</w:t>
       </w:r>
     </w:p>
     <w:p>
@@ -428,20 +415,24 @@
         <w:jc w:val="both"/>
       </w:pPr>
       <w:r>
-        <w:t xml:space="preserve">Scientists measure earthquakes with a seismograph. A seismograph is a special machine that measures ground movements. By studying earthquakes, scientists learn how to build safer houses to protect people.</w:t>
-      </w:r>
-    </w:p>
-    <w:p>
-      <w:pPr>
-        <w:spacing w:after="60" w:before="120"/>
+        <w:t>Scientists measure earthquakes with a seismograph. A seismograph is a special machine that measures ground movements. By studying earthquakes, scientists learn how to build safer houses to protect people.</w:t>
+      </w:r>
+    </w:p>
+    <w:p>
+      <w:pPr>
+        <w:spacing w:before="120" w:after="60"/>
         <w:jc w:val="center"/>
       </w:pPr>
       <w:r>
+        <w:rPr>
+          <w:noProof/>
+        </w:rPr>
+        <w:lastRenderedPageBreak/>
         <w:drawing>
-          <wp:inline distT="0" distB="0" distL="0" distR="0">
+          <wp:inline distT="0" distB="0" distL="0" distR="0" wp14:anchorId="3A931DDC" wp14:editId="38ED579D">
             <wp:extent cx="4762500" cy="2667000"/>
-            <wp:effectExtent t="0" r="0" b="0" l="0"/>
-            <wp:docPr id="1" name="Seismograph" descr="Pen drawing waves on recording paper" title="Seismograph drum"/>
+            <wp:effectExtent l="0" t="0" r="0" b="0"/>
+            <wp:docPr id="1125467469" name="Seismograph" descr="Pen drawing waves on recording paper" title="Seismograph drum"/>
             <wp:cNvGraphicFramePr>
               <a:graphicFrameLocks xmlns:a="http://schemas.openxmlformats.org/drawingml/2006/main" noChangeAspect="1"/>
             </wp:cNvGraphicFramePr>
@@ -449,13 +440,13 @@
               <a:graphicData uri="http://schemas.openxmlformats.org/drawingml/2006/picture">
                 <pic:pic xmlns:pic="http://schemas.openxmlformats.org/drawingml/2006/picture">
                   <pic:nvPicPr>
-                    <pic:cNvPr id="0" name="" descr=""/>
+                    <pic:cNvPr id="0" name=""/>
                     <pic:cNvPicPr>
                       <a:picLocks noChangeAspect="1" noChangeArrowheads="1"/>
                     </pic:cNvPicPr>
                   </pic:nvPicPr>
                   <pic:blipFill>
-                    <a:blip r:embed="rId10" cstate="none"/>
+                    <a:blip r:embed="rId8"/>
                     <a:srcRect/>
                     <a:stretch>
                       <a:fillRect/>
@@ -486,7 +477,6 @@
         <w:rPr>
           <w:b/>
           <w:bCs/>
-          <w:color w:val="1E242B"/>
           <w:sz w:val="16"/>
           <w:szCs w:val="16"/>
         </w:rPr>
@@ -498,7 +488,7 @@
           <w:sz w:val="16"/>
           <w:szCs w:val="16"/>
         </w:rPr>
-        <w:t xml:space="preserve">A close-up of a seismograph machine translating raw seismic energy waves into measurable line ripples on paper.</w:t>
+        <w:t>A close-up of a seismograph machine translating raw seismic energy waves into measurable line ripples on paper.</w:t>
       </w:r>
     </w:p>
     <w:p>
@@ -509,45 +499,45 @@
         <w:rPr>
           <w:b/>
           <w:bCs/>
-          <w:color w:val="1E242B"/>
           <w:sz w:val="20"/>
           <w:szCs w:val="20"/>
         </w:rPr>
-        <w:t xml:space="preserve">KEY TERMINOLOGY</w:t>
+        <w:t>KEY TERMINOLOGY</w:t>
       </w:r>
     </w:p>
     <w:tbl>
       <w:tblPr>
-        <w:tblW w:type="auto" w:w="100"/>
+        <w:tblW w:w="100" w:type="auto"/>
         <w:tblBorders>
-          <w:top w:val="single" w:color="auto" w:sz="4"/>
-          <w:left w:val="single" w:color="auto" w:sz="4"/>
-          <w:bottom w:val="single" w:color="auto" w:sz="4"/>
-          <w:right w:val="single" w:color="auto" w:sz="4"/>
-          <w:insideH w:val="single" w:color="auto" w:sz="4"/>
-          <w:insideV w:val="single" w:color="auto" w:sz="4"/>
+          <w:top w:val="single" w:sz="4" w:space="0" w:color="auto"/>
+          <w:left w:val="single" w:sz="4" w:space="0" w:color="auto"/>
+          <w:bottom w:val="single" w:sz="4" w:space="0" w:color="auto"/>
+          <w:right w:val="single" w:sz="4" w:space="0" w:color="auto"/>
+          <w:insideH w:val="single" w:sz="4" w:space="0" w:color="auto"/>
+          <w:insideV w:val="single" w:sz="4" w:space="0" w:color="auto"/>
         </w:tblBorders>
         <w:tblCellMar>
-          <w:top w:type="dxa" w:w="180"/>
-          <w:left w:type="dxa" w:w="180"/>
-          <w:bottom w:type="dxa" w:w="180"/>
-          <w:right w:type="dxa" w:w="180"/>
+          <w:top w:w="180" w:type="dxa"/>
+          <w:left w:w="180" w:type="dxa"/>
+          <w:bottom w:w="180" w:type="dxa"/>
+          <w:right w:w="180" w:type="dxa"/>
         </w:tblCellMar>
+        <w:tblLook w:val="04A0" w:firstRow="1" w:lastRow="0" w:firstColumn="1" w:lastColumn="0" w:noHBand="0" w:noVBand="1"/>
       </w:tblPr>
       <w:tblGrid>
-        <w:gridCol w:w="9026"/>
+        <w:gridCol w:w="8995"/>
       </w:tblGrid>
       <w:tr>
         <w:tc>
           <w:tcPr>
-            <w:tcW w:type="dxa" w:w="9026"/>
+            <w:tcW w:w="9026" w:type="dxa"/>
             <w:tcBorders>
-              <w:top w:val="single" w:color="DCDBD7" w:sz="1"/>
-              <w:left w:val="single" w:color="C2410C" w:sz="24"/>
-              <w:bottom w:val="single" w:color="DCDBD7" w:sz="1"/>
-              <w:right w:val="single" w:color="DCDBD7" w:sz="1"/>
+              <w:top w:val="single" w:sz="1" w:space="0" w:color="DCDBD7"/>
+              <w:left w:val="single" w:sz="24" w:space="0" w:color="C2410C"/>
+              <w:bottom w:val="single" w:sz="1" w:space="0" w:color="DCDBD7"/>
+              <w:right w:val="single" w:sz="1" w:space="0" w:color="DCDBD7"/>
             </w:tcBorders>
-            <w:shd w:fill="FAF9F5" w:val="clear"/>
+            <w:shd w:val="clear" w:color="auto" w:fill="FAF9F5"/>
           </w:tcPr>
           <w:p>
             <w:pPr>
@@ -562,7 +552,7 @@
               <w:t xml:space="preserve">Epicentre: </w:t>
             </w:r>
             <w:r>
-              <w:t xml:space="preserve">The spot on the ground directly above where the earthquake starts.</w:t>
+              <w:t>The spot on the ground directly above where the earthquake starts.</w:t>
             </w:r>
           </w:p>
           <w:p>
@@ -578,7 +568,7 @@
               <w:t xml:space="preserve">Fault Line: </w:t>
             </w:r>
             <w:r>
-              <w:t xml:space="preserve">A crack in the Earth's crust where rocks can slip and move.</w:t>
+              <w:t>A crack in the Earth's crust where rocks can slip and move.</w:t>
             </w:r>
           </w:p>
           <w:p>
@@ -594,7 +584,7 @@
               <w:t xml:space="preserve">Focus: </w:t>
             </w:r>
             <w:r>
-              <w:t xml:space="preserve">The deep spot underground where the rocks first break and move.</w:t>
+              <w:t>The deep spot underground where the rocks first break and move.</w:t>
             </w:r>
           </w:p>
           <w:p>
@@ -610,7 +600,7 @@
               <w:t xml:space="preserve">Seismic Waves: </w:t>
             </w:r>
             <w:r>
-              <w:t xml:space="preserve">Ripples of energy that travel through the ground and make it shake.</w:t>
+              <w:t>Ripples of energy that travel through the ground and make it shake.</w:t>
             </w:r>
           </w:p>
           <w:p>
@@ -626,7 +616,7 @@
               <w:t xml:space="preserve">Seismograph: </w:t>
             </w:r>
             <w:r>
-              <w:t xml:space="preserve">A special machine that measures how much the ground shakes.</w:t>
+              <w:t>A special machine that measures how much the ground shakes.</w:t>
             </w:r>
           </w:p>
           <w:p>
@@ -642,7 +632,7 @@
               <w:t xml:space="preserve">Tectonic: </w:t>
             </w:r>
             <w:r>
-              <w:t xml:space="preserve">Having to do with the Earth's crust and how its large pieces move.</w:t>
+              <w:t>Having to do with the Earth's crust and how its large pieces move.</w:t>
             </w:r>
           </w:p>
           <w:p>
@@ -658,7 +648,7 @@
               <w:t xml:space="preserve">Tectonic Plate: </w:t>
             </w:r>
             <w:r>
-              <w:t xml:space="preserve">A giant puzzle piece made of rock that forms the Earth's outer shell.</w:t>
+              <w:t>A giant puzzle piece made of rock that forms the Earth's outer shell.</w:t>
             </w:r>
           </w:p>
           <w:p>
@@ -671,7 +661,7 @@
               <w:t xml:space="preserve">Tension: </w:t>
             </w:r>
             <w:r>
-              <w:t xml:space="preserve">Pressure that builds up when rocks are stuck and trying to move.</w:t>
+              <w:t>Pressure that builds up when rocks are stuck and trying to move.</w:t>
             </w:r>
           </w:p>
         </w:tc>
@@ -687,11 +677,10 @@
         <w:rPr>
           <w:b/>
           <w:bCs/>
-          <w:color w:val="1E242B"/>
           <w:sz w:val="20"/>
           <w:szCs w:val="20"/>
         </w:rPr>
-        <w:t xml:space="preserve">Plate Boundary Types (Field Comparison Table)</w:t>
+        <w:t>Plate Boundary Types (Field Comparison Table)</w:t>
       </w:r>
     </w:p>
     <w:p>
@@ -701,26 +690,27 @@
     </w:p>
     <w:tbl>
       <w:tblPr>
-        <w:tblW w:type="auto" w:w="100"/>
+        <w:tblW w:w="100" w:type="auto"/>
         <w:tblBorders>
-          <w:top w:val="single" w:color="auto" w:sz="4"/>
-          <w:left w:val="single" w:color="auto" w:sz="4"/>
-          <w:bottom w:val="single" w:color="auto" w:sz="4"/>
-          <w:right w:val="single" w:color="auto" w:sz="4"/>
-          <w:insideH w:val="single" w:color="auto" w:sz="4"/>
-          <w:insideV w:val="single" w:color="auto" w:sz="4"/>
+          <w:top w:val="single" w:sz="4" w:space="0" w:color="auto"/>
+          <w:left w:val="single" w:sz="4" w:space="0" w:color="auto"/>
+          <w:bottom w:val="single" w:sz="4" w:space="0" w:color="auto"/>
+          <w:right w:val="single" w:sz="4" w:space="0" w:color="auto"/>
+          <w:insideH w:val="single" w:sz="4" w:space="0" w:color="auto"/>
+          <w:insideV w:val="single" w:sz="4" w:space="0" w:color="auto"/>
         </w:tblBorders>
         <w:tblCellMar>
-          <w:top w:type="dxa" w:w="120"/>
-          <w:left w:type="dxa" w:w="120"/>
-          <w:bottom w:type="dxa" w:w="120"/>
-          <w:right w:type="dxa" w:w="120"/>
+          <w:top w:w="120" w:type="dxa"/>
+          <w:left w:w="120" w:type="dxa"/>
+          <w:bottom w:w="120" w:type="dxa"/>
+          <w:right w:w="120" w:type="dxa"/>
         </w:tblCellMar>
+        <w:tblLook w:val="04A0" w:firstRow="1" w:lastRow="0" w:firstColumn="1" w:lastColumn="0" w:noHBand="0" w:noVBand="1"/>
       </w:tblPr>
       <w:tblGrid>
         <w:gridCol w:w="2500"/>
-        <w:gridCol w:w="3000"/>
-        <w:gridCol w:w="3526"/>
+        <w:gridCol w:w="2999"/>
+        <w:gridCol w:w="3525"/>
       </w:tblGrid>
       <w:tr>
         <w:trPr>
@@ -728,14 +718,14 @@
         </w:trPr>
         <w:tc>
           <w:tcPr>
-            <w:tcW w:type="dxa" w:w="2500"/>
+            <w:tcW w:w="2500" w:type="dxa"/>
             <w:tcBorders>
-              <w:top w:val="single" w:color="DCDBD7" w:sz="1"/>
-              <w:left w:val="single" w:color="DCDBD7" w:sz="1"/>
-              <w:bottom w:val="single" w:color="C2410C" w:sz="12"/>
-              <w:right w:val="single" w:color="DCDBD7" w:sz="1"/>
+              <w:top w:val="single" w:sz="1" w:space="0" w:color="DCDBD7"/>
+              <w:left w:val="single" w:sz="1" w:space="0" w:color="DCDBD7"/>
+              <w:bottom w:val="single" w:sz="12" w:space="0" w:color="C2410C"/>
+              <w:right w:val="single" w:sz="1" w:space="0" w:color="DCDBD7"/>
             </w:tcBorders>
-            <w:shd w:fill="1E242B" w:val="clear"/>
+            <w:shd w:val="clear" w:color="auto" w:fill="1E242B"/>
           </w:tcPr>
           <w:p>
             <w:r>
@@ -744,20 +734,20 @@
                 <w:bCs/>
                 <w:color w:val="FFFFFF"/>
               </w:rPr>
-              <w:t xml:space="preserve">Boundary Type</w:t>
+              <w:t>Boundary Type</w:t>
             </w:r>
           </w:p>
         </w:tc>
         <w:tc>
           <w:tcPr>
-            <w:tcW w:type="dxa" w:w="3000"/>
+            <w:tcW w:w="3000" w:type="dxa"/>
             <w:tcBorders>
-              <w:top w:val="single" w:color="DCDBD7" w:sz="1"/>
-              <w:left w:val="single" w:color="DCDBD7" w:sz="1"/>
-              <w:bottom w:val="single" w:color="C2410C" w:sz="12"/>
-              <w:right w:val="single" w:color="DCDBD7" w:sz="1"/>
+              <w:top w:val="single" w:sz="1" w:space="0" w:color="DCDBD7"/>
+              <w:left w:val="single" w:sz="1" w:space="0" w:color="DCDBD7"/>
+              <w:bottom w:val="single" w:sz="12" w:space="0" w:color="C2410C"/>
+              <w:right w:val="single" w:sz="1" w:space="0" w:color="DCDBD7"/>
             </w:tcBorders>
-            <w:shd w:fill="1E242B" w:val="clear"/>
+            <w:shd w:val="clear" w:color="auto" w:fill="1E242B"/>
           </w:tcPr>
           <w:p>
             <w:r>
@@ -766,20 +756,20 @@
                 <w:bCs/>
                 <w:color w:val="FFFFFF"/>
               </w:rPr>
-              <w:t xml:space="preserve">Direction of Movement</w:t>
+              <w:t>Direction of Movement</w:t>
             </w:r>
           </w:p>
         </w:tc>
         <w:tc>
           <w:tcPr>
-            <w:tcW w:type="dxa" w:w="3526"/>
+            <w:tcW w:w="3526" w:type="dxa"/>
             <w:tcBorders>
-              <w:top w:val="single" w:color="DCDBD7" w:sz="1"/>
-              <w:left w:val="single" w:color="DCDBD7" w:sz="1"/>
-              <w:bottom w:val="single" w:color="C2410C" w:sz="12"/>
-              <w:right w:val="single" w:color="DCDBD7" w:sz="1"/>
+              <w:top w:val="single" w:sz="1" w:space="0" w:color="DCDBD7"/>
+              <w:left w:val="single" w:sz="1" w:space="0" w:color="DCDBD7"/>
+              <w:bottom w:val="single" w:sz="12" w:space="0" w:color="C2410C"/>
+              <w:right w:val="single" w:sz="1" w:space="0" w:color="DCDBD7"/>
             </w:tcBorders>
-            <w:shd w:fill="1E242B" w:val="clear"/>
+            <w:shd w:val="clear" w:color="auto" w:fill="1E242B"/>
           </w:tcPr>
           <w:p>
             <w:r>
@@ -788,7 +778,7 @@
                 <w:bCs/>
                 <w:color w:val="FFFFFF"/>
               </w:rPr>
-              <w:t xml:space="preserve">Geological Features Produced</w:t>
+              <w:t>Geological Features Produced</w:t>
             </w:r>
           </w:p>
         </w:tc>
@@ -796,12 +786,12 @@
       <w:tr>
         <w:tc>
           <w:tcPr>
-            <w:tcW w:type="dxa" w:w="2500"/>
+            <w:tcW w:w="2500" w:type="dxa"/>
             <w:tcBorders>
-              <w:top w:val="single" w:color="DCDBD7" w:sz="1"/>
-              <w:left w:val="single" w:color="DCDBD7" w:sz="1"/>
-              <w:bottom w:val="single" w:color="DCDBD7" w:sz="1"/>
-              <w:right w:val="single" w:color="DCDBD7" w:sz="1"/>
+              <w:top w:val="single" w:sz="1" w:space="0" w:color="DCDBD7"/>
+              <w:left w:val="single" w:sz="1" w:space="0" w:color="DCDBD7"/>
+              <w:bottom w:val="single" w:sz="1" w:space="0" w:color="DCDBD7"/>
+              <w:right w:val="single" w:sz="1" w:space="0" w:color="DCDBD7"/>
             </w:tcBorders>
           </w:tcPr>
           <w:p>
@@ -811,39 +801,39 @@
                 <w:bCs/>
                 <w:color w:val="C2410C"/>
               </w:rPr>
-              <w:t xml:space="preserve">Convergent Boundary</w:t>
+              <w:t>Convergent Boundary</w:t>
             </w:r>
           </w:p>
         </w:tc>
         <w:tc>
           <w:tcPr>
-            <w:tcW w:type="dxa" w:w="3000"/>
+            <w:tcW w:w="3000" w:type="dxa"/>
             <w:tcBorders>
-              <w:top w:val="single" w:color="DCDBD7" w:sz="1"/>
-              <w:left w:val="single" w:color="DCDBD7" w:sz="1"/>
-              <w:bottom w:val="single" w:color="DCDBD7" w:sz="1"/>
-              <w:right w:val="single" w:color="DCDBD7" w:sz="1"/>
+              <w:top w:val="single" w:sz="1" w:space="0" w:color="DCDBD7"/>
+              <w:left w:val="single" w:sz="1" w:space="0" w:color="DCDBD7"/>
+              <w:bottom w:val="single" w:sz="1" w:space="0" w:color="DCDBD7"/>
+              <w:right w:val="single" w:sz="1" w:space="0" w:color="DCDBD7"/>
             </w:tcBorders>
           </w:tcPr>
           <w:p>
             <w:r>
-              <w:t xml:space="preserve">Plates push together</w:t>
+              <w:t>Plates push together</w:t>
             </w:r>
           </w:p>
         </w:tc>
         <w:tc>
           <w:tcPr>
-            <w:tcW w:type="dxa" w:w="3526"/>
+            <w:tcW w:w="3526" w:type="dxa"/>
             <w:tcBorders>
-              <w:top w:val="single" w:color="DCDBD7" w:sz="1"/>
-              <w:left w:val="single" w:color="DCDBD7" w:sz="1"/>
-              <w:bottom w:val="single" w:color="DCDBD7" w:sz="1"/>
-              <w:right w:val="single" w:color="DCDBD7" w:sz="1"/>
+              <w:top w:val="single" w:sz="1" w:space="0" w:color="DCDBD7"/>
+              <w:left w:val="single" w:sz="1" w:space="0" w:color="DCDBD7"/>
+              <w:bottom w:val="single" w:sz="1" w:space="0" w:color="DCDBD7"/>
+              <w:right w:val="single" w:sz="1" w:space="0" w:color="DCDBD7"/>
             </w:tcBorders>
           </w:tcPr>
           <w:p>
             <w:r>
-              <w:t xml:space="preserve">Big mountains, deep ocean trenches, and strong earthquakes</w:t>
+              <w:t>Big mountains, deep ocean trenches, and strong earthquakes</w:t>
             </w:r>
           </w:p>
         </w:tc>
@@ -851,14 +841,14 @@
       <w:tr>
         <w:tc>
           <w:tcPr>
-            <w:tcW w:type="dxa" w:w="2500"/>
+            <w:tcW w:w="2500" w:type="dxa"/>
             <w:tcBorders>
-              <w:top w:val="single" w:color="DCDBD7" w:sz="1"/>
-              <w:left w:val="single" w:color="DCDBD7" w:sz="1"/>
-              <w:bottom w:val="single" w:color="DCDBD7" w:sz="1"/>
-              <w:right w:val="single" w:color="DCDBD7" w:sz="1"/>
+              <w:top w:val="single" w:sz="1" w:space="0" w:color="DCDBD7"/>
+              <w:left w:val="single" w:sz="1" w:space="0" w:color="DCDBD7"/>
+              <w:bottom w:val="single" w:sz="1" w:space="0" w:color="DCDBD7"/>
+              <w:right w:val="single" w:sz="1" w:space="0" w:color="DCDBD7"/>
             </w:tcBorders>
-            <w:shd w:fill="FAF9F5" w:val="clear"/>
+            <w:shd w:val="clear" w:color="auto" w:fill="FAF9F5"/>
           </w:tcPr>
           <w:p>
             <w:r>
@@ -867,41 +857,41 @@
                 <w:bCs/>
                 <w:color w:val="C2410C"/>
               </w:rPr>
-              <w:t xml:space="preserve">Divergent Boundary</w:t>
+              <w:t>Divergent Boundary</w:t>
             </w:r>
           </w:p>
         </w:tc>
         <w:tc>
           <w:tcPr>
-            <w:tcW w:type="dxa" w:w="3000"/>
+            <w:tcW w:w="3000" w:type="dxa"/>
             <w:tcBorders>
-              <w:top w:val="single" w:color="DCDBD7" w:sz="1"/>
-              <w:left w:val="single" w:color="DCDBD7" w:sz="1"/>
-              <w:bottom w:val="single" w:color="DCDBD7" w:sz="1"/>
-              <w:right w:val="single" w:color="DCDBD7" w:sz="1"/>
+              <w:top w:val="single" w:sz="1" w:space="0" w:color="DCDBD7"/>
+              <w:left w:val="single" w:sz="1" w:space="0" w:color="DCDBD7"/>
+              <w:bottom w:val="single" w:sz="1" w:space="0" w:color="DCDBD7"/>
+              <w:right w:val="single" w:sz="1" w:space="0" w:color="DCDBD7"/>
             </w:tcBorders>
-            <w:shd w:fill="FAF9F5" w:val="clear"/>
+            <w:shd w:val="clear" w:color="auto" w:fill="FAF9F5"/>
           </w:tcPr>
           <w:p>
             <w:r>
-              <w:t xml:space="preserve">Plates pull apart</w:t>
+              <w:t>Plates pull apart</w:t>
             </w:r>
           </w:p>
         </w:tc>
         <w:tc>
           <w:tcPr>
-            <w:tcW w:type="dxa" w:w="3526"/>
+            <w:tcW w:w="3526" w:type="dxa"/>
             <w:tcBorders>
-              <w:top w:val="single" w:color="DCDBD7" w:sz="1"/>
-              <w:left w:val="single" w:color="DCDBD7" w:sz="1"/>
-              <w:bottom w:val="single" w:color="DCDBD7" w:sz="1"/>
-              <w:right w:val="single" w:color="DCDBD7" w:sz="1"/>
+              <w:top w:val="single" w:sz="1" w:space="0" w:color="DCDBD7"/>
+              <w:left w:val="single" w:sz="1" w:space="0" w:color="DCDBD7"/>
+              <w:bottom w:val="single" w:sz="1" w:space="0" w:color="DCDBD7"/>
+              <w:right w:val="single" w:sz="1" w:space="0" w:color="DCDBD7"/>
             </w:tcBorders>
-            <w:shd w:fill="FAF9F5" w:val="clear"/>
+            <w:shd w:val="clear" w:color="auto" w:fill="FAF9F5"/>
           </w:tcPr>
           <w:p>
             <w:r>
-              <w:t xml:space="preserve">Deep valleys, active volcanoes, and small earthquakes</w:t>
+              <w:t>Deep valleys, active volcanoes, and small earthquakes</w:t>
             </w:r>
           </w:p>
         </w:tc>
@@ -909,12 +899,12 @@
       <w:tr>
         <w:tc>
           <w:tcPr>
-            <w:tcW w:type="dxa" w:w="2500"/>
+            <w:tcW w:w="2500" w:type="dxa"/>
             <w:tcBorders>
-              <w:top w:val="single" w:color="DCDBD7" w:sz="1"/>
-              <w:left w:val="single" w:color="DCDBD7" w:sz="1"/>
-              <w:bottom w:val="single" w:color="DCDBD7" w:sz="1"/>
-              <w:right w:val="single" w:color="DCDBD7" w:sz="1"/>
+              <w:top w:val="single" w:sz="1" w:space="0" w:color="DCDBD7"/>
+              <w:left w:val="single" w:sz="1" w:space="0" w:color="DCDBD7"/>
+              <w:bottom w:val="single" w:sz="1" w:space="0" w:color="DCDBD7"/>
+              <w:right w:val="single" w:sz="1" w:space="0" w:color="DCDBD7"/>
             </w:tcBorders>
           </w:tcPr>
           <w:p>
@@ -924,39 +914,39 @@
                 <w:bCs/>
                 <w:color w:val="C2410C"/>
               </w:rPr>
-              <w:t xml:space="preserve">Transform Boundary</w:t>
+              <w:t>Transform Boundary</w:t>
             </w:r>
           </w:p>
         </w:tc>
         <w:tc>
           <w:tcPr>
-            <w:tcW w:type="dxa" w:w="3000"/>
+            <w:tcW w:w="3000" w:type="dxa"/>
             <w:tcBorders>
-              <w:top w:val="single" w:color="DCDBD7" w:sz="1"/>
-              <w:left w:val="single" w:color="DCDBD7" w:sz="1"/>
-              <w:bottom w:val="single" w:color="DCDBD7" w:sz="1"/>
-              <w:right w:val="single" w:color="DCDBD7" w:sz="1"/>
+              <w:top w:val="single" w:sz="1" w:space="0" w:color="DCDBD7"/>
+              <w:left w:val="single" w:sz="1" w:space="0" w:color="DCDBD7"/>
+              <w:bottom w:val="single" w:sz="1" w:space="0" w:color="DCDBD7"/>
+              <w:right w:val="single" w:sz="1" w:space="0" w:color="DCDBD7"/>
             </w:tcBorders>
           </w:tcPr>
           <w:p>
             <w:r>
-              <w:t xml:space="preserve">Plates slide past each other</w:t>
+              <w:t>Plates slide past each other</w:t>
             </w:r>
           </w:p>
         </w:tc>
         <w:tc>
           <w:tcPr>
-            <w:tcW w:type="dxa" w:w="3526"/>
+            <w:tcW w:w="3526" w:type="dxa"/>
             <w:tcBorders>
-              <w:top w:val="single" w:color="DCDBD7" w:sz="1"/>
-              <w:left w:val="single" w:color="DCDBD7" w:sz="1"/>
-              <w:bottom w:val="single" w:color="DCDBD7" w:sz="1"/>
-              <w:right w:val="single" w:color="DCDBD7" w:sz="1"/>
+              <w:top w:val="single" w:sz="1" w:space="0" w:color="DCDBD7"/>
+              <w:left w:val="single" w:sz="1" w:space="0" w:color="DCDBD7"/>
+              <w:bottom w:val="single" w:sz="1" w:space="0" w:color="DCDBD7"/>
+              <w:right w:val="single" w:sz="1" w:space="0" w:color="DCDBD7"/>
             </w:tcBorders>
           </w:tcPr>
           <w:p>
             <w:r>
-              <w:t xml:space="preserve">Cracks in the ground (faults) and damaging earthquakes</w:t>
+              <w:t>Cracks in the ground (faults) and damaging earthquakes</w:t>
             </w:r>
           </w:p>
         </w:tc>
@@ -965,110 +955,25 @@
     <w:p>
       <w:pPr>
         <w:spacing w:before="720"/>
-        <w:jc w:val="center"/>
-      </w:pPr>
-      <w:r>
-        <w:rPr>
-          <w:color w:val="57606A"/>
-          <w:sz w:val="14"/>
-          <w:szCs w:val="14"/>
-        </w:rPr>
-        <w:t xml:space="preserve">© 2026 Science Focus Magazine • Year 3 Science Worksheet Reading • Natural Disasters Unit</w:t>
-      </w:r>
+      </w:pPr>
     </w:p>
     <w:sectPr>
-      <w:pgSz w:w="11906" w:h="16838" w:orient="portrait"/>
-      <w:pgMar w:top="1440" w:right="1440" w:bottom="1440" w:left="1440" w:header="708" w:footer="708" w:gutter="0"/>
-      <w:pgNumType/>
+      <w:pgSz w:w="11906" w:h="16838"/>
+      <w:pgMar w:top="1440" w:right="1440" w:bottom="851" w:left="1440" w:header="708" w:footer="708" w:gutter="0"/>
+      <w:cols w:space="720"/>
       <w:docGrid w:linePitch="360"/>
     </w:sectPr>
   </w:body>
 </w:document>
 </file>
 
-<file path=word/comments.xml><?xml version="1.0" encoding="utf-8"?>
-<w:comments xmlns:cx="http://schemas.microsoft.com/office/drawing/2014/chartex" xmlns:cx1="http://schemas.microsoft.com/office/drawing/2015/9/8/chartex" xmlns:cx2="http://schemas.microsoft.com/office/drawing/2015/10/21/chartex" xmlns:cx3="http://schemas.microsoft.com/office/drawing/2016/5/9/chartex" xmlns:cx4="http://schemas.microsoft.com/office/drawing/2016/5/10/chartex" xmlns:cx5="http://schemas.microsoft.com/office/drawing/2016/5/11/chartex" xmlns:cx6="http://schemas.microsoft.com/office/drawing/2016/5/12/chartex" xmlns:cx7="http://schemas.microsoft.com/office/drawing/2016/5/13/chartex" xmlns:cx8="http://schemas.microsoft.com/office/drawing/2016/5/14/chartex" xmlns:mc="http://schemas.openxmlformats.org/markup-compatibility/2006" xmlns:aink="http://schemas.microsoft.com/office/drawing/2016/ink" xmlns:am3d="http://schemas.microsoft.com/office/drawing/2017/model3d" xmlns:o="urn:schemas-microsoft-com:office:office" xmlns:r="http://schemas.openxmlformats.org/officeDocument/2006/relationships" xmlns:m="http://schemas.openxmlformats.org/officeDocument/2006/math" xmlns:v="urn:schemas-microsoft-com:vml" xmlns:wp14="http://schemas.microsoft.com/office/word/2010/wordprocessingDrawing" xmlns:wp="http://schemas.openxmlformats.org/drawingml/2006/wordprocessingDrawing" xmlns:w10="urn:schemas-microsoft-com:office:word" xmlns:w="http://schemas.openxmlformats.org/wordprocessingml/2006/main" xmlns:w14="http://schemas.microsoft.com/office/word/2010/wordml" xmlns:w15="http://schemas.microsoft.com/office/word/2012/wordml" xmlns:w16cex="http://schemas.microsoft.com/office/word/2018/wordml/cex" xmlns:w16cid="http://schemas.microsoft.com/office/word/2016/wordml/cid" xmlns:w16="http://schemas.microsoft.com/office/word/2018/wordml" xmlns:w16sdtdh="http://schemas.microsoft.com/office/word/2020/wordml/sdtdatahash" xmlns:w16se="http://schemas.microsoft.com/office/word/2015/wordml/symex" xmlns:wpg="http://schemas.microsoft.com/office/word/2010/wordprocessingGroup" xmlns:wpi="http://schemas.microsoft.com/office/word/2010/wordprocessingInk" xmlns:wne="http://schemas.microsoft.com/office/word/2006/wordml" xmlns:wps="http://schemas.microsoft.com/office/word/2010/wordprocessingShape"/>
-</file>
-
-<file path=word/endnotes.xml><?xml version="1.0" encoding="utf-8"?>
-<w:endnotes xmlns:wpc="http://schemas.microsoft.com/office/word/2010/wordprocessingCanvas" xmlns:mc="http://schemas.openxmlformats.org/markup-compatibility/2006" xmlns:o="urn:schemas-microsoft-com:office:office" xmlns:r="http://schemas.openxmlformats.org/officeDocument/2006/relationships" xmlns:m="http://schemas.openxmlformats.org/officeDocument/2006/math" xmlns:v="urn:schemas-microsoft-com:vml" xmlns:wp14="http://schemas.microsoft.com/office/word/2010/wordprocessingDrawing" xmlns:wp="http://schemas.openxmlformats.org/drawingml/2006/wordprocessingDrawing" xmlns:w10="urn:schemas-microsoft-com:office:word" xmlns:w="http://schemas.openxmlformats.org/wordprocessingml/2006/main" xmlns:w14="http://schemas.microsoft.com/office/word/2010/wordml" xmlns:w15="http://schemas.microsoft.com/office/word/2012/wordml" xmlns:wpg="http://schemas.microsoft.com/office/word/2010/wordprocessingGroup" xmlns:wpi="http://schemas.microsoft.com/office/word/2010/wordprocessingInk" xmlns:wne="http://schemas.microsoft.com/office/word/2006/wordml" xmlns:wps="http://schemas.microsoft.com/office/word/2010/wordprocessingShape" mc:Ignorable="w14 w15 wp14">
-  <w:endnote w:type="separator" w:id="-1">
-    <w:p>
-      <w:pPr>
-        <w:spacing w:after="0" w:line="240" w:lineRule="auto"/>
-      </w:pPr>
-      <w:r>
-        <w:rPr>
-          <w:rStyle w:val="EndnoteReference"/>
-        </w:rPr>
-        <w:endnoteRef/>
-      </w:r>
-      <w:r>
-        <w:separator/>
-      </w:r>
-    </w:p>
-  </w:endnote>
-  <w:endnote w:type="continuationSeparator" w:id="0">
-    <w:p>
-      <w:pPr>
-        <w:spacing w:after="0" w:line="240" w:lineRule="auto"/>
-      </w:pPr>
-      <w:r>
-        <w:rPr>
-          <w:rStyle w:val="EndnoteReference"/>
-        </w:rPr>
-        <w:endnoteRef/>
-      </w:r>
-      <w:r>
-        <w:continuationSeparator/>
-      </w:r>
-    </w:p>
-  </w:endnote>
-</w:endnotes>
-</file>
-
-<file path=word/footnotes.xml><?xml version="1.0" encoding="utf-8"?>
-<w:footnotes xmlns:wpc="http://schemas.microsoft.com/office/word/2010/wordprocessingCanvas" xmlns:mc="http://schemas.openxmlformats.org/markup-compatibility/2006" xmlns:o="urn:schemas-microsoft-com:office:office" xmlns:r="http://schemas.openxmlformats.org/officeDocument/2006/relationships" xmlns:m="http://schemas.openxmlformats.org/officeDocument/2006/math" xmlns:v="urn:schemas-microsoft-com:vml" xmlns:wp14="http://schemas.microsoft.com/office/word/2010/wordprocessingDrawing" xmlns:wp="http://schemas.openxmlformats.org/drawingml/2006/wordprocessingDrawing" xmlns:w10="urn:schemas-microsoft-com:office:word" xmlns:w="http://schemas.openxmlformats.org/wordprocessingml/2006/main" xmlns:w14="http://schemas.microsoft.com/office/word/2010/wordml" xmlns:w15="http://schemas.microsoft.com/office/word/2012/wordml" xmlns:wpg="http://schemas.microsoft.com/office/word/2010/wordprocessingGroup" xmlns:wpi="http://schemas.microsoft.com/office/word/2010/wordprocessingInk" xmlns:wne="http://schemas.microsoft.com/office/word/2006/wordml" xmlns:wps="http://schemas.microsoft.com/office/word/2010/wordprocessingShape" mc:Ignorable="w14 w15 wp14">
-  <w:footnote w:type="separator" w:id="-1">
-    <w:p>
-      <w:pPr>
-        <w:spacing w:after="0" w:line="240" w:lineRule="auto"/>
-      </w:pPr>
-      <w:r>
-        <w:rPr>
-          <w:rStyle w:val="FootnoteReference"/>
-        </w:rPr>
-        <w:footnoteRef/>
-      </w:r>
-      <w:r>
-        <w:separator/>
-      </w:r>
-    </w:p>
-  </w:footnote>
-  <w:footnote w:type="continuationSeparator" w:id="0">
-    <w:p>
-      <w:pPr>
-        <w:spacing w:after="0" w:line="240" w:lineRule="auto"/>
-      </w:pPr>
-      <w:r>
-        <w:rPr>
-          <w:rStyle w:val="FootnoteReference"/>
-        </w:rPr>
-        <w:footnoteRef/>
-      </w:r>
-      <w:r>
-        <w:continuationSeparator/>
-      </w:r>
-    </w:p>
-  </w:footnote>
-</w:footnotes>
-</file>
-
 <file path=word/numbering.xml><?xml version="1.0" encoding="utf-8"?>
-<w:numbering xmlns:wpc="http://schemas.microsoft.com/office/word/2010/wordprocessingCanvas" xmlns:mc="http://schemas.openxmlformats.org/markup-compatibility/2006" xmlns:o="urn:schemas-microsoft-com:office:office" xmlns:r="http://schemas.openxmlformats.org/officeDocument/2006/relationships" xmlns:m="http://schemas.openxmlformats.org/officeDocument/2006/math" xmlns:v="urn:schemas-microsoft-com:vml" xmlns:wp14="http://schemas.microsoft.com/office/word/2010/wordprocessingDrawing" xmlns:wp="http://schemas.openxmlformats.org/drawingml/2006/wordprocessingDrawing" xmlns:w10="urn:schemas-microsoft-com:office:word" xmlns:w="http://schemas.openxmlformats.org/wordprocessingml/2006/main" xmlns:w14="http://schemas.microsoft.com/office/word/2010/wordml" xmlns:w15="http://schemas.microsoft.com/office/word/2012/wordml" xmlns:wpg="http://schemas.microsoft.com/office/word/2010/wordprocessingGroup" xmlns:wpi="http://schemas.microsoft.com/office/word/2010/wordprocessingInk" xmlns:wne="http://schemas.microsoft.com/office/word/2006/wordml" xmlns:wps="http://schemas.microsoft.com/office/word/2010/wordprocessingShape" mc:Ignorable="w14 w15 wp14">
-  <w:abstractNum w:abstractNumId="1" w15:restartNumberingAfterBreak="0">
+<w:numbering xmlns:wpc="http://schemas.microsoft.com/office/word/2010/wordprocessingCanvas" xmlns:cx="http://schemas.microsoft.com/office/drawing/2014/chartex" xmlns:cx1="http://schemas.microsoft.com/office/drawing/2015/9/8/chartex" xmlns:cx2="http://schemas.microsoft.com/office/drawing/2015/10/21/chartex" xmlns:cx3="http://schemas.microsoft.com/office/drawing/2016/5/9/chartex" xmlns:cx4="http://schemas.microsoft.com/office/drawing/2016/5/10/chartex" xmlns:cx5="http://schemas.microsoft.com/office/drawing/2016/5/11/chartex" xmlns:cx6="http://schemas.microsoft.com/office/drawing/2016/5/12/chartex" xmlns:cx7="http://schemas.microsoft.com/office/drawing/2016/5/13/chartex" xmlns:cx8="http://schemas.microsoft.com/office/drawing/2016/5/14/chartex" xmlns:mc="http://schemas.openxmlformats.org/markup-compatibility/2006" xmlns:aink="http://schemas.microsoft.com/office/drawing/2016/ink" xmlns:am3d="http://schemas.microsoft.com/office/drawing/2017/model3d" xmlns:o="urn:schemas-microsoft-com:office:office" xmlns:oel="http://schemas.microsoft.com/office/2019/extlst" xmlns:r="http://schemas.openxmlformats.org/officeDocument/2006/relationships" xmlns:m="http://schemas.openxmlformats.org/officeDocument/2006/math" xmlns:v="urn:schemas-microsoft-com:vml" xmlns:wp14="http://schemas.microsoft.com/office/word/2010/wordprocessingDrawing" xmlns:wp="http://schemas.openxmlformats.org/drawingml/2006/wordprocessingDrawing" xmlns:w10="urn:schemas-microsoft-com:office:word" xmlns:w="http://schemas.openxmlformats.org/wordprocessingml/2006/main" xmlns:w14="http://schemas.microsoft.com/office/word/2010/wordml" xmlns:w15="http://schemas.microsoft.com/office/word/2012/wordml" xmlns:w16cex="http://schemas.microsoft.com/office/word/2018/wordml/cex" xmlns:w16cid="http://schemas.microsoft.com/office/word/2016/wordml/cid" xmlns:w16="http://schemas.microsoft.com/office/word/2018/wordml" xmlns:w16du="http://schemas.microsoft.com/office/word/2023/wordml/word16du" xmlns:w16sdtdh="http://schemas.microsoft.com/office/word/2020/wordml/sdtdatahash" xmlns:w16sdtfl="http://schemas.microsoft.com/office/word/2024/wordml/sdtformatlock" xmlns:w16se="http://schemas.microsoft.com/office/word/2015/wordml/symex" xmlns:wpg="http://schemas.microsoft.com/office/word/2010/wordprocessingGroup" xmlns:wpi="http://schemas.microsoft.com/office/word/2010/wordprocessingInk" xmlns:wne="http://schemas.microsoft.com/office/word/2006/wordml" xmlns:wps="http://schemas.microsoft.com/office/word/2010/wordprocessingShape" mc:Ignorable="w14 w15 w16se w16cid w16 w16cex w16sdtdh w16sdtfl w16du wp14">
+  <w:abstractNum w:abstractNumId="0" w15:restartNumberingAfterBreak="0">
+    <w:nsid w:val="2EED7A16"/>
     <w:multiLevelType w:val="hybridMultilevel"/>
-    <w:lvl w:ilvl="0" w15:tentative="1">
+    <w:tmpl w:val="C41026C2"/>
+    <w:lvl w:ilvl="0" w:tplc="2CE00C26">
       <w:start w:val="1"/>
       <w:numFmt w:val="bullet"/>
       <w:lvlText w:val="●"/>
@@ -1077,7 +982,7 @@
         <w:ind w:left="720" w:hanging="360"/>
       </w:pPr>
     </w:lvl>
-    <w:lvl w:ilvl="1" w15:tentative="1">
+    <w:lvl w:ilvl="1" w:tplc="72E2D266">
       <w:start w:val="1"/>
       <w:numFmt w:val="bullet"/>
       <w:lvlText w:val="○"/>
@@ -1086,7 +991,7 @@
         <w:ind w:left="1440" w:hanging="360"/>
       </w:pPr>
     </w:lvl>
-    <w:lvl w:ilvl="2" w15:tentative="1">
+    <w:lvl w:ilvl="2" w:tplc="4A5653FA">
       <w:start w:val="1"/>
       <w:numFmt w:val="bullet"/>
       <w:lvlText w:val="■"/>
@@ -1095,7 +1000,7 @@
         <w:ind w:left="2160" w:hanging="360"/>
       </w:pPr>
     </w:lvl>
-    <w:lvl w:ilvl="3" w15:tentative="1">
+    <w:lvl w:ilvl="3" w:tplc="F37A4A9A">
       <w:start w:val="1"/>
       <w:numFmt w:val="bullet"/>
       <w:lvlText w:val="●"/>
@@ -1104,7 +1009,7 @@
         <w:ind w:left="2880" w:hanging="360"/>
       </w:pPr>
     </w:lvl>
-    <w:lvl w:ilvl="4" w15:tentative="1">
+    <w:lvl w:ilvl="4" w:tplc="87DA5FCE">
       <w:start w:val="1"/>
       <w:numFmt w:val="bullet"/>
       <w:lvlText w:val="○"/>
@@ -1113,7 +1018,7 @@
         <w:ind w:left="3600" w:hanging="360"/>
       </w:pPr>
     </w:lvl>
-    <w:lvl w:ilvl="5" w15:tentative="1">
+    <w:lvl w:ilvl="5" w:tplc="FEFE057E">
       <w:start w:val="1"/>
       <w:numFmt w:val="bullet"/>
       <w:lvlText w:val="■"/>
@@ -1122,7 +1027,7 @@
         <w:ind w:left="4320" w:hanging="360"/>
       </w:pPr>
     </w:lvl>
-    <w:lvl w:ilvl="6" w15:tentative="1">
+    <w:lvl w:ilvl="6" w:tplc="11D8E4EA">
       <w:start w:val="1"/>
       <w:numFmt w:val="bullet"/>
       <w:lvlText w:val="●"/>
@@ -1131,7 +1036,7 @@
         <w:ind w:left="5040" w:hanging="360"/>
       </w:pPr>
     </w:lvl>
-    <w:lvl w:ilvl="7" w15:tentative="1">
+    <w:lvl w:ilvl="7" w:tplc="9D6487B0">
       <w:start w:val="1"/>
       <w:numFmt w:val="bullet"/>
       <w:lvlText w:val="●"/>
@@ -1140,7 +1045,7 @@
         <w:ind w:left="5760" w:hanging="360"/>
       </w:pPr>
     </w:lvl>
-    <w:lvl w:ilvl="8" w15:tentative="1">
+    <w:lvl w:ilvl="8" w:tplc="FE48D242">
       <w:start w:val="1"/>
       <w:numFmt w:val="bullet"/>
       <w:lvlText w:val="●"/>
@@ -1150,8 +1055,8 @@
       </w:pPr>
     </w:lvl>
   </w:abstractNum>
-  <w:num w:numId="1">
-    <w:abstractNumId w:val="1"/>
+  <w:num w:numId="1" w16cid:durableId="67391045">
+    <w:abstractNumId w:val="0"/>
     <w:lvlOverride w:ilvl="0">
       <w:startOverride w:val="1"/>
     </w:lvlOverride>
@@ -1160,33 +1065,408 @@
 </file>
 
 <file path=word/styles.xml><?xml version="1.0" encoding="utf-8"?>
-<w:styles xmlns:mc="http://schemas.openxmlformats.org/markup-compatibility/2006" xmlns:r="http://schemas.openxmlformats.org/officeDocument/2006/relationships" xmlns:w="http://schemas.openxmlformats.org/wordprocessingml/2006/main" xmlns:w14="http://schemas.microsoft.com/office/word/2010/wordml" xmlns:w15="http://schemas.microsoft.com/office/word/2012/wordml" mc:Ignorable="w14 w15">
+<w:styles xmlns:mc="http://schemas.openxmlformats.org/markup-compatibility/2006" xmlns:r="http://schemas.openxmlformats.org/officeDocument/2006/relationships" xmlns:w="http://schemas.openxmlformats.org/wordprocessingml/2006/main" xmlns:w14="http://schemas.microsoft.com/office/word/2010/wordml" xmlns:w15="http://schemas.microsoft.com/office/word/2012/wordml" xmlns:w16cex="http://schemas.microsoft.com/office/word/2018/wordml/cex" xmlns:w16cid="http://schemas.microsoft.com/office/word/2016/wordml/cid" xmlns:w16="http://schemas.microsoft.com/office/word/2018/wordml" xmlns:w16du="http://schemas.microsoft.com/office/word/2023/wordml/word16du" xmlns:w16sdtdh="http://schemas.microsoft.com/office/word/2020/wordml/sdtdatahash" xmlns:w16sdtfl="http://schemas.microsoft.com/office/word/2024/wordml/sdtformatlock" xmlns:w16se="http://schemas.microsoft.com/office/word/2015/wordml/symex" mc:Ignorable="w14 w15 w16se w16cid w16 w16cex w16sdtdh w16sdtfl w16du">
   <w:docDefaults>
     <w:rPrDefault>
       <w:rPr>
-        <w:rFonts w:ascii="Arial" w:cs="Arial" w:eastAsia="Arial" w:hAnsi="Arial"/>
+        <w:rFonts w:ascii="Arial" w:eastAsia="Arial" w:hAnsi="Arial" w:cs="Arial"/>
         <w:color w:val="1E242B"/>
         <w:sz w:val="23"/>
         <w:szCs w:val="23"/>
+        <w:lang w:val="en-AU" w:eastAsia="en-AU" w:bidi="ar-SA"/>
       </w:rPr>
     </w:rPrDefault>
     <w:pPrDefault/>
   </w:docDefaults>
-  <w:style w:type="paragraph" w:styleId="Title">
-    <w:name w:val="Title"/>
-    <w:basedOn w:val="Normal"/>
-    <w:next w:val="Normal"/>
+  <w:latentStyles w:defLockedState="0" w:defUIPriority="99" w:defSemiHidden="0" w:defUnhideWhenUsed="0" w:defQFormat="0" w:count="376">
+    <w:lsdException w:name="Normal" w:uiPriority="0" w:qFormat="1"/>
+    <w:lsdException w:name="heading 1" w:uiPriority="9" w:qFormat="1"/>
+    <w:lsdException w:name="heading 2" w:semiHidden="1" w:uiPriority="9" w:unhideWhenUsed="1" w:qFormat="1"/>
+    <w:lsdException w:name="heading 3" w:semiHidden="1" w:uiPriority="9" w:unhideWhenUsed="1" w:qFormat="1"/>
+    <w:lsdException w:name="heading 4" w:semiHidden="1" w:uiPriority="9" w:unhideWhenUsed="1" w:qFormat="1"/>
+    <w:lsdException w:name="heading 5" w:semiHidden="1" w:uiPriority="9" w:unhideWhenUsed="1" w:qFormat="1"/>
+    <w:lsdException w:name="heading 6" w:semiHidden="1" w:uiPriority="9" w:unhideWhenUsed="1" w:qFormat="1"/>
+    <w:lsdException w:name="heading 7" w:semiHidden="1" w:uiPriority="9" w:unhideWhenUsed="1" w:qFormat="1"/>
+    <w:lsdException w:name="heading 8" w:semiHidden="1" w:uiPriority="9" w:unhideWhenUsed="1" w:qFormat="1"/>
+    <w:lsdException w:name="heading 9" w:semiHidden="1" w:uiPriority="9" w:unhideWhenUsed="1" w:qFormat="1"/>
+    <w:lsdException w:name="index 1" w:semiHidden="1" w:unhideWhenUsed="1"/>
+    <w:lsdException w:name="index 2" w:semiHidden="1" w:unhideWhenUsed="1"/>
+    <w:lsdException w:name="index 3" w:semiHidden="1" w:unhideWhenUsed="1"/>
+    <w:lsdException w:name="index 4" w:semiHidden="1" w:unhideWhenUsed="1"/>
+    <w:lsdException w:name="index 5" w:semiHidden="1" w:unhideWhenUsed="1"/>
+    <w:lsdException w:name="index 6" w:semiHidden="1" w:unhideWhenUsed="1"/>
+    <w:lsdException w:name="index 7" w:semiHidden="1" w:unhideWhenUsed="1"/>
+    <w:lsdException w:name="index 8" w:semiHidden="1" w:unhideWhenUsed="1"/>
+    <w:lsdException w:name="index 9" w:semiHidden="1" w:unhideWhenUsed="1"/>
+    <w:lsdException w:name="toc 1" w:semiHidden="1" w:uiPriority="39" w:unhideWhenUsed="1"/>
+    <w:lsdException w:name="toc 2" w:semiHidden="1" w:uiPriority="39" w:unhideWhenUsed="1"/>
+    <w:lsdException w:name="toc 3" w:semiHidden="1" w:uiPriority="39" w:unhideWhenUsed="1"/>
+    <w:lsdException w:name="toc 4" w:semiHidden="1" w:uiPriority="39" w:unhideWhenUsed="1"/>
+    <w:lsdException w:name="toc 5" w:semiHidden="1" w:uiPriority="39" w:unhideWhenUsed="1"/>
+    <w:lsdException w:name="toc 6" w:semiHidden="1" w:uiPriority="39" w:unhideWhenUsed="1"/>
+    <w:lsdException w:name="toc 7" w:semiHidden="1" w:uiPriority="39" w:unhideWhenUsed="1"/>
+    <w:lsdException w:name="toc 8" w:semiHidden="1" w:uiPriority="39" w:unhideWhenUsed="1"/>
+    <w:lsdException w:name="toc 9" w:semiHidden="1" w:uiPriority="39" w:unhideWhenUsed="1"/>
+    <w:lsdException w:name="Normal Indent" w:semiHidden="1" w:unhideWhenUsed="1"/>
+    <w:lsdException w:name="footnote text" w:semiHidden="1" w:unhideWhenUsed="1"/>
+    <w:lsdException w:name="annotation text" w:semiHidden="1" w:unhideWhenUsed="1"/>
+    <w:lsdException w:name="header" w:semiHidden="1" w:unhideWhenUsed="1"/>
+    <w:lsdException w:name="footer" w:semiHidden="1" w:unhideWhenUsed="1"/>
+    <w:lsdException w:name="index heading" w:semiHidden="1" w:unhideWhenUsed="1"/>
+    <w:lsdException w:name="caption" w:semiHidden="1" w:uiPriority="35" w:unhideWhenUsed="1" w:qFormat="1"/>
+    <w:lsdException w:name="table of figures" w:semiHidden="1" w:unhideWhenUsed="1"/>
+    <w:lsdException w:name="envelope address" w:semiHidden="1" w:unhideWhenUsed="1"/>
+    <w:lsdException w:name="envelope return" w:semiHidden="1" w:unhideWhenUsed="1"/>
+    <w:lsdException w:name="footnote reference" w:semiHidden="1" w:unhideWhenUsed="1"/>
+    <w:lsdException w:name="annotation reference" w:semiHidden="1" w:unhideWhenUsed="1"/>
+    <w:lsdException w:name="line number" w:semiHidden="1" w:unhideWhenUsed="1"/>
+    <w:lsdException w:name="page number" w:semiHidden="1" w:unhideWhenUsed="1"/>
+    <w:lsdException w:name="endnote reference" w:semiHidden="1" w:unhideWhenUsed="1"/>
+    <w:lsdException w:name="endnote text" w:semiHidden="1" w:unhideWhenUsed="1"/>
+    <w:lsdException w:name="table of authorities" w:semiHidden="1" w:unhideWhenUsed="1"/>
+    <w:lsdException w:name="macro" w:semiHidden="1" w:unhideWhenUsed="1"/>
+    <w:lsdException w:name="toa heading" w:semiHidden="1" w:unhideWhenUsed="1"/>
+    <w:lsdException w:name="List" w:semiHidden="1" w:unhideWhenUsed="1"/>
+    <w:lsdException w:name="List Bullet" w:semiHidden="1" w:unhideWhenUsed="1"/>
+    <w:lsdException w:name="List Number" w:semiHidden="1" w:unhideWhenUsed="1"/>
+    <w:lsdException w:name="List 2" w:semiHidden="1" w:unhideWhenUsed="1"/>
+    <w:lsdException w:name="List 3" w:semiHidden="1" w:unhideWhenUsed="1"/>
+    <w:lsdException w:name="List 4" w:semiHidden="1" w:unhideWhenUsed="1"/>
+    <w:lsdException w:name="List 5" w:semiHidden="1" w:unhideWhenUsed="1"/>
+    <w:lsdException w:name="List Bullet 2" w:semiHidden="1" w:unhideWhenUsed="1"/>
+    <w:lsdException w:name="List Bullet 3" w:semiHidden="1" w:unhideWhenUsed="1"/>
+    <w:lsdException w:name="List Bullet 4" w:semiHidden="1" w:unhideWhenUsed="1"/>
+    <w:lsdException w:name="List Bullet 5" w:semiHidden="1" w:unhideWhenUsed="1"/>
+    <w:lsdException w:name="List Number 2" w:semiHidden="1" w:unhideWhenUsed="1"/>
+    <w:lsdException w:name="List Number 3" w:semiHidden="1" w:unhideWhenUsed="1"/>
+    <w:lsdException w:name="List Number 4" w:semiHidden="1" w:unhideWhenUsed="1"/>
+    <w:lsdException w:name="List Number 5" w:semiHidden="1" w:unhideWhenUsed="1"/>
+    <w:lsdException w:name="Title" w:uiPriority="10" w:qFormat="1"/>
+    <w:lsdException w:name="Closing" w:semiHidden="1" w:unhideWhenUsed="1"/>
+    <w:lsdException w:name="Signature" w:semiHidden="1" w:unhideWhenUsed="1"/>
+    <w:lsdException w:name="Default Paragraph Font" w:semiHidden="1" w:uiPriority="1" w:unhideWhenUsed="1"/>
+    <w:lsdException w:name="Body Text" w:semiHidden="1" w:unhideWhenUsed="1"/>
+    <w:lsdException w:name="Body Text Indent" w:semiHidden="1" w:unhideWhenUsed="1"/>
+    <w:lsdException w:name="List Continue" w:semiHidden="1" w:unhideWhenUsed="1"/>
+    <w:lsdException w:name="List Continue 2" w:semiHidden="1" w:unhideWhenUsed="1"/>
+    <w:lsdException w:name="List Continue 3" w:semiHidden="1" w:unhideWhenUsed="1"/>
+    <w:lsdException w:name="List Continue 4" w:semiHidden="1" w:unhideWhenUsed="1"/>
+    <w:lsdException w:name="List Continue 5" w:semiHidden="1" w:unhideWhenUsed="1"/>
+    <w:lsdException w:name="Message Header" w:semiHidden="1" w:unhideWhenUsed="1"/>
+    <w:lsdException w:name="Subtitle" w:uiPriority="11" w:qFormat="1"/>
+    <w:lsdException w:name="Salutation" w:semiHidden="1" w:unhideWhenUsed="1"/>
+    <w:lsdException w:name="Date" w:semiHidden="1" w:unhideWhenUsed="1"/>
+    <w:lsdException w:name="Body Text First Indent" w:semiHidden="1" w:unhideWhenUsed="1"/>
+    <w:lsdException w:name="Body Text First Indent 2" w:semiHidden="1" w:unhideWhenUsed="1"/>
+    <w:lsdException w:name="Note Heading" w:semiHidden="1" w:unhideWhenUsed="1"/>
+    <w:lsdException w:name="Body Text 2" w:semiHidden="1" w:unhideWhenUsed="1"/>
+    <w:lsdException w:name="Body Text 3" w:semiHidden="1" w:unhideWhenUsed="1"/>
+    <w:lsdException w:name="Body Text Indent 2" w:semiHidden="1" w:unhideWhenUsed="1"/>
+    <w:lsdException w:name="Body Text Indent 3" w:semiHidden="1" w:unhideWhenUsed="1"/>
+    <w:lsdException w:name="Block Text" w:semiHidden="1" w:unhideWhenUsed="1"/>
+    <w:lsdException w:name="Hyperlink" w:semiHidden="1" w:unhideWhenUsed="1"/>
+    <w:lsdException w:name="FollowedHyperlink" w:semiHidden="1" w:unhideWhenUsed="1"/>
+    <w:lsdException w:name="Strong" w:uiPriority="22" w:qFormat="1"/>
+    <w:lsdException w:name="Emphasis" w:uiPriority="20" w:qFormat="1"/>
+    <w:lsdException w:name="Document Map" w:semiHidden="1" w:unhideWhenUsed="1"/>
+    <w:lsdException w:name="Plain Text" w:semiHidden="1" w:unhideWhenUsed="1"/>
+    <w:lsdException w:name="E-mail Signature" w:semiHidden="1" w:unhideWhenUsed="1"/>
+    <w:lsdException w:name="HTML Top of Form" w:semiHidden="1" w:unhideWhenUsed="1"/>
+    <w:lsdException w:name="HTML Bottom of Form" w:semiHidden="1" w:unhideWhenUsed="1"/>
+    <w:lsdException w:name="Normal (Web)" w:semiHidden="1" w:unhideWhenUsed="1"/>
+    <w:lsdException w:name="HTML Acronym" w:semiHidden="1" w:unhideWhenUsed="1"/>
+    <w:lsdException w:name="HTML Address" w:semiHidden="1" w:unhideWhenUsed="1"/>
+    <w:lsdException w:name="HTML Cite" w:semiHidden="1" w:unhideWhenUsed="1"/>
+    <w:lsdException w:name="HTML Code" w:semiHidden="1" w:unhideWhenUsed="1"/>
+    <w:lsdException w:name="HTML Definition" w:semiHidden="1" w:unhideWhenUsed="1"/>
+    <w:lsdException w:name="HTML Keyboard" w:semiHidden="1" w:unhideWhenUsed="1"/>
+    <w:lsdException w:name="HTML Preformatted" w:semiHidden="1" w:unhideWhenUsed="1"/>
+    <w:lsdException w:name="HTML Sample" w:semiHidden="1" w:unhideWhenUsed="1"/>
+    <w:lsdException w:name="HTML Typewriter" w:semiHidden="1" w:unhideWhenUsed="1"/>
+    <w:lsdException w:name="HTML Variable" w:semiHidden="1" w:unhideWhenUsed="1"/>
+    <w:lsdException w:name="Normal Table" w:semiHidden="1" w:unhideWhenUsed="1"/>
+    <w:lsdException w:name="annotation subject" w:semiHidden="1" w:unhideWhenUsed="1"/>
+    <w:lsdException w:name="No List" w:semiHidden="1" w:unhideWhenUsed="1"/>
+    <w:lsdException w:name="Outline List 1" w:semiHidden="1" w:unhideWhenUsed="1"/>
+    <w:lsdException w:name="Outline List 2" w:semiHidden="1" w:unhideWhenUsed="1"/>
+    <w:lsdException w:name="Outline List 3" w:semiHidden="1" w:unhideWhenUsed="1"/>
+    <w:lsdException w:name="Table Simple 1" w:semiHidden="1" w:unhideWhenUsed="1"/>
+    <w:lsdException w:name="Table Simple 2" w:semiHidden="1" w:unhideWhenUsed="1"/>
+    <w:lsdException w:name="Table Simple 3" w:semiHidden="1" w:unhideWhenUsed="1"/>
+    <w:lsdException w:name="Table Classic 1" w:semiHidden="1" w:unhideWhenUsed="1"/>
+    <w:lsdException w:name="Table Classic 2" w:semiHidden="1" w:unhideWhenUsed="1"/>
+    <w:lsdException w:name="Table Classic 3" w:semiHidden="1" w:unhideWhenUsed="1"/>
+    <w:lsdException w:name="Table Classic 4" w:semiHidden="1" w:unhideWhenUsed="1"/>
+    <w:lsdException w:name="Table Colorful 1" w:semiHidden="1" w:unhideWhenUsed="1"/>
+    <w:lsdException w:name="Table Colorful 2" w:semiHidden="1" w:unhideWhenUsed="1"/>
+    <w:lsdException w:name="Table Colorful 3" w:semiHidden="1" w:unhideWhenUsed="1"/>
+    <w:lsdException w:name="Table Columns 1" w:semiHidden="1" w:unhideWhenUsed="1"/>
+    <w:lsdException w:name="Table Columns 2" w:semiHidden="1" w:unhideWhenUsed="1"/>
+    <w:lsdException w:name="Table Columns 3" w:semiHidden="1" w:unhideWhenUsed="1"/>
+    <w:lsdException w:name="Table Columns 4" w:semiHidden="1" w:unhideWhenUsed="1"/>
+    <w:lsdException w:name="Table Columns 5" w:semiHidden="1" w:unhideWhenUsed="1"/>
+    <w:lsdException w:name="Table Grid 1" w:semiHidden="1" w:unhideWhenUsed="1"/>
+    <w:lsdException w:name="Table Grid 2" w:semiHidden="1" w:unhideWhenUsed="1"/>
+    <w:lsdException w:name="Table Grid 3" w:semiHidden="1" w:unhideWhenUsed="1"/>
+    <w:lsdException w:name="Table Grid 4" w:semiHidden="1" w:unhideWhenUsed="1"/>
+    <w:lsdException w:name="Table Grid 5" w:semiHidden="1" w:unhideWhenUsed="1"/>
+    <w:lsdException w:name="Table Grid 6" w:semiHidden="1" w:unhideWhenUsed="1"/>
+    <w:lsdException w:name="Table Grid 7" w:semiHidden="1" w:unhideWhenUsed="1"/>
+    <w:lsdException w:name="Table Grid 8" w:semiHidden="1" w:unhideWhenUsed="1"/>
+    <w:lsdException w:name="Table List 1" w:semiHidden="1" w:unhideWhenUsed="1"/>
+    <w:lsdException w:name="Table List 2" w:semiHidden="1" w:unhideWhenUsed="1"/>
+    <w:lsdException w:name="Table List 3" w:semiHidden="1" w:unhideWhenUsed="1"/>
+    <w:lsdException w:name="Table List 4" w:semiHidden="1" w:unhideWhenUsed="1"/>
+    <w:lsdException w:name="Table List 5" w:semiHidden="1" w:unhideWhenUsed="1"/>
+    <w:lsdException w:name="Table List 6" w:semiHidden="1" w:unhideWhenUsed="1"/>
+    <w:lsdException w:name="Table List 7" w:semiHidden="1" w:unhideWhenUsed="1"/>
+    <w:lsdException w:name="Table List 8" w:semiHidden="1" w:unhideWhenUsed="1"/>
+    <w:lsdException w:name="Table 3D effects 1" w:semiHidden="1" w:unhideWhenUsed="1"/>
+    <w:lsdException w:name="Table 3D effects 2" w:semiHidden="1" w:unhideWhenUsed="1"/>
+    <w:lsdException w:name="Table 3D effects 3" w:semiHidden="1" w:unhideWhenUsed="1"/>
+    <w:lsdException w:name="Table Contemporary" w:semiHidden="1" w:unhideWhenUsed="1"/>
+    <w:lsdException w:name="Table Elegant" w:semiHidden="1" w:unhideWhenUsed="1"/>
+    <w:lsdException w:name="Table Professional" w:semiHidden="1" w:unhideWhenUsed="1"/>
+    <w:lsdException w:name="Table Subtle 1" w:semiHidden="1" w:unhideWhenUsed="1"/>
+    <w:lsdException w:name="Table Subtle 2" w:semiHidden="1" w:unhideWhenUsed="1"/>
+    <w:lsdException w:name="Table Web 1" w:semiHidden="1" w:unhideWhenUsed="1"/>
+    <w:lsdException w:name="Table Web 2" w:semiHidden="1" w:unhideWhenUsed="1"/>
+    <w:lsdException w:name="Table Web 3" w:semiHidden="1" w:unhideWhenUsed="1"/>
+    <w:lsdException w:name="Balloon Text" w:semiHidden="1" w:unhideWhenUsed="1"/>
+    <w:lsdException w:name="Table Grid" w:uiPriority="39"/>
+    <w:lsdException w:name="Table Theme" w:semiHidden="1" w:unhideWhenUsed="1"/>
+    <w:lsdException w:name="Placeholder Text" w:semiHidden="1"/>
+    <w:lsdException w:name="No Spacing" w:uiPriority="1" w:qFormat="1"/>
+    <w:lsdException w:name="Light Shading" w:uiPriority="60"/>
+    <w:lsdException w:name="Light List" w:uiPriority="61"/>
+    <w:lsdException w:name="Light Grid" w:uiPriority="62"/>
+    <w:lsdException w:name="Medium Shading 1" w:uiPriority="63"/>
+    <w:lsdException w:name="Medium Shading 2" w:uiPriority="64"/>
+    <w:lsdException w:name="Medium List 1" w:uiPriority="65"/>
+    <w:lsdException w:name="Medium List 2" w:uiPriority="66"/>
+    <w:lsdException w:name="Medium Grid 1" w:uiPriority="67"/>
+    <w:lsdException w:name="Medium Grid 2" w:uiPriority="68"/>
+    <w:lsdException w:name="Medium Grid 3" w:uiPriority="69"/>
+    <w:lsdException w:name="Dark List" w:uiPriority="70"/>
+    <w:lsdException w:name="Colorful Shading" w:uiPriority="71"/>
+    <w:lsdException w:name="Colorful List" w:uiPriority="72"/>
+    <w:lsdException w:name="Colorful Grid" w:uiPriority="73"/>
+    <w:lsdException w:name="Light Shading Accent 1" w:uiPriority="60"/>
+    <w:lsdException w:name="Light List Accent 1" w:uiPriority="61"/>
+    <w:lsdException w:name="Light Grid Accent 1" w:uiPriority="62"/>
+    <w:lsdException w:name="Medium Shading 1 Accent 1" w:uiPriority="63"/>
+    <w:lsdException w:name="Medium Shading 2 Accent 1" w:uiPriority="64"/>
+    <w:lsdException w:name="Medium List 1 Accent 1" w:uiPriority="65"/>
+    <w:lsdException w:name="Revision" w:semiHidden="1"/>
+    <w:lsdException w:name="List Paragraph" w:uiPriority="34" w:qFormat="1"/>
+    <w:lsdException w:name="Quote" w:uiPriority="29" w:qFormat="1"/>
+    <w:lsdException w:name="Intense Quote" w:uiPriority="30" w:qFormat="1"/>
+    <w:lsdException w:name="Medium List 2 Accent 1" w:uiPriority="66"/>
+    <w:lsdException w:name="Medium Grid 1 Accent 1" w:uiPriority="67"/>
+    <w:lsdException w:name="Medium Grid 2 Accent 1" w:uiPriority="68"/>
+    <w:lsdException w:name="Medium Grid 3 Accent 1" w:uiPriority="69"/>
+    <w:lsdException w:name="Dark List Accent 1" w:uiPriority="70"/>
+    <w:lsdException w:name="Colorful Shading Accent 1" w:uiPriority="71"/>
+    <w:lsdException w:name="Colorful List Accent 1" w:uiPriority="72"/>
+    <w:lsdException w:name="Colorful Grid Accent 1" w:uiPriority="73"/>
+    <w:lsdException w:name="Light Shading Accent 2" w:uiPriority="60"/>
+    <w:lsdException w:name="Light List Accent 2" w:uiPriority="61"/>
+    <w:lsdException w:name="Light Grid Accent 2" w:uiPriority="62"/>
+    <w:lsdException w:name="Medium Shading 1 Accent 2" w:uiPriority="63"/>
+    <w:lsdException w:name="Medium Shading 2 Accent 2" w:uiPriority="64"/>
+    <w:lsdException w:name="Medium List 1 Accent 2" w:uiPriority="65"/>
+    <w:lsdException w:name="Medium List 2 Accent 2" w:uiPriority="66"/>
+    <w:lsdException w:name="Medium Grid 1 Accent 2" w:uiPriority="67"/>
+    <w:lsdException w:name="Medium Grid 2 Accent 2" w:uiPriority="68"/>
+    <w:lsdException w:name="Medium Grid 3 Accent 2" w:uiPriority="69"/>
+    <w:lsdException w:name="Dark List Accent 2" w:uiPriority="70"/>
+    <w:lsdException w:name="Colorful Shading Accent 2" w:uiPriority="71"/>
+    <w:lsdException w:name="Colorful List Accent 2" w:uiPriority="72"/>
+    <w:lsdException w:name="Colorful Grid Accent 2" w:uiPriority="73"/>
+    <w:lsdException w:name="Light Shading Accent 3" w:uiPriority="60"/>
+    <w:lsdException w:name="Light List Accent 3" w:uiPriority="61"/>
+    <w:lsdException w:name="Light Grid Accent 3" w:uiPriority="62"/>
+    <w:lsdException w:name="Medium Shading 1 Accent 3" w:uiPriority="63"/>
+    <w:lsdException w:name="Medium Shading 2 Accent 3" w:uiPriority="64"/>
+    <w:lsdException w:name="Medium List 1 Accent 3" w:uiPriority="65"/>
+    <w:lsdException w:name="Medium List 2 Accent 3" w:uiPriority="66"/>
+    <w:lsdException w:name="Medium Grid 1 Accent 3" w:uiPriority="67"/>
+    <w:lsdException w:name="Medium Grid 2 Accent 3" w:uiPriority="68"/>
+    <w:lsdException w:name="Medium Grid 3 Accent 3" w:uiPriority="69"/>
+    <w:lsdException w:name="Dark List Accent 3" w:uiPriority="70"/>
+    <w:lsdException w:name="Colorful Shading Accent 3" w:uiPriority="71"/>
+    <w:lsdException w:name="Colorful List Accent 3" w:uiPriority="72"/>
+    <w:lsdException w:name="Colorful Grid Accent 3" w:uiPriority="73"/>
+    <w:lsdException w:name="Light Shading Accent 4" w:uiPriority="60"/>
+    <w:lsdException w:name="Light List Accent 4" w:uiPriority="61"/>
+    <w:lsdException w:name="Light Grid Accent 4" w:uiPriority="62"/>
+    <w:lsdException w:name="Medium Shading 1 Accent 4" w:uiPriority="63"/>
+    <w:lsdException w:name="Medium Shading 2 Accent 4" w:uiPriority="64"/>
+    <w:lsdException w:name="Medium List 1 Accent 4" w:uiPriority="65"/>
+    <w:lsdException w:name="Medium List 2 Accent 4" w:uiPriority="66"/>
+    <w:lsdException w:name="Medium Grid 1 Accent 4" w:uiPriority="67"/>
+    <w:lsdException w:name="Medium Grid 2 Accent 4" w:uiPriority="68"/>
+    <w:lsdException w:name="Medium Grid 3 Accent 4" w:uiPriority="69"/>
+    <w:lsdException w:name="Dark List Accent 4" w:uiPriority="70"/>
+    <w:lsdException w:name="Colorful Shading Accent 4" w:uiPriority="71"/>
+    <w:lsdException w:name="Colorful List Accent 4" w:uiPriority="72"/>
+    <w:lsdException w:name="Colorful Grid Accent 4" w:uiPriority="73"/>
+    <w:lsdException w:name="Light Shading Accent 5" w:uiPriority="60"/>
+    <w:lsdException w:name="Light List Accent 5" w:uiPriority="61"/>
+    <w:lsdException w:name="Light Grid Accent 5" w:uiPriority="62"/>
+    <w:lsdException w:name="Medium Shading 1 Accent 5" w:uiPriority="63"/>
+    <w:lsdException w:name="Medium Shading 2 Accent 5" w:uiPriority="64"/>
+    <w:lsdException w:name="Medium List 1 Accent 5" w:uiPriority="65"/>
+    <w:lsdException w:name="Medium List 2 Accent 5" w:uiPriority="66"/>
+    <w:lsdException w:name="Medium Grid 1 Accent 5" w:uiPriority="67"/>
+    <w:lsdException w:name="Medium Grid 2 Accent 5" w:uiPriority="68"/>
+    <w:lsdException w:name="Medium Grid 3 Accent 5" w:uiPriority="69"/>
+    <w:lsdException w:name="Dark List Accent 5" w:uiPriority="70"/>
+    <w:lsdException w:name="Colorful Shading Accent 5" w:uiPriority="71"/>
+    <w:lsdException w:name="Colorful List Accent 5" w:uiPriority="72"/>
+    <w:lsdException w:name="Colorful Grid Accent 5" w:uiPriority="73"/>
+    <w:lsdException w:name="Light Shading Accent 6" w:uiPriority="60"/>
+    <w:lsdException w:name="Light List Accent 6" w:uiPriority="61"/>
+    <w:lsdException w:name="Light Grid Accent 6" w:uiPriority="62"/>
+    <w:lsdException w:name="Medium Shading 1 Accent 6" w:uiPriority="63"/>
+    <w:lsdException w:name="Medium Shading 2 Accent 6" w:uiPriority="64"/>
+    <w:lsdException w:name="Medium List 1 Accent 6" w:uiPriority="65"/>
+    <w:lsdException w:name="Medium List 2 Accent 6" w:uiPriority="66"/>
+    <w:lsdException w:name="Medium Grid 1 Accent 6" w:uiPriority="67"/>
+    <w:lsdException w:name="Medium Grid 2 Accent 6" w:uiPriority="68"/>
+    <w:lsdException w:name="Medium Grid 3 Accent 6" w:uiPriority="69"/>
+    <w:lsdException w:name="Dark List Accent 6" w:uiPriority="70"/>
+    <w:lsdException w:name="Colorful Shading Accent 6" w:uiPriority="71"/>
+    <w:lsdException w:name="Colorful List Accent 6" w:uiPriority="72"/>
+    <w:lsdException w:name="Colorful Grid Accent 6" w:uiPriority="73"/>
+    <w:lsdException w:name="Subtle Emphasis" w:uiPriority="19" w:qFormat="1"/>
+    <w:lsdException w:name="Intense Emphasis" w:uiPriority="21" w:qFormat="1"/>
+    <w:lsdException w:name="Subtle Reference" w:uiPriority="31" w:qFormat="1"/>
+    <w:lsdException w:name="Intense Reference" w:uiPriority="32" w:qFormat="1"/>
+    <w:lsdException w:name="Book Title" w:uiPriority="33" w:qFormat="1"/>
+    <w:lsdException w:name="Bibliography" w:semiHidden="1" w:uiPriority="37" w:unhideWhenUsed="1"/>
+    <w:lsdException w:name="TOC Heading" w:semiHidden="1" w:uiPriority="39" w:unhideWhenUsed="1" w:qFormat="1"/>
+    <w:lsdException w:name="Plain Table 1" w:uiPriority="41"/>
+    <w:lsdException w:name="Plain Table 2" w:uiPriority="42"/>
+    <w:lsdException w:name="Plain Table 3" w:uiPriority="43"/>
+    <w:lsdException w:name="Plain Table 4" w:uiPriority="44"/>
+    <w:lsdException w:name="Plain Table 5" w:uiPriority="45"/>
+    <w:lsdException w:name="Grid Table Light" w:uiPriority="40"/>
+    <w:lsdException w:name="Grid Table 1 Light" w:uiPriority="46"/>
+    <w:lsdException w:name="Grid Table 2" w:uiPriority="47"/>
+    <w:lsdException w:name="Grid Table 3" w:uiPriority="48"/>
+    <w:lsdException w:name="Grid Table 4" w:uiPriority="49"/>
+    <w:lsdException w:name="Grid Table 5 Dark" w:uiPriority="50"/>
+    <w:lsdException w:name="Grid Table 6 Colorful" w:uiPriority="51"/>
+    <w:lsdException w:name="Grid Table 7 Colorful" w:uiPriority="52"/>
+    <w:lsdException w:name="Grid Table 1 Light Accent 1" w:uiPriority="46"/>
+    <w:lsdException w:name="Grid Table 2 Accent 1" w:uiPriority="47"/>
+    <w:lsdException w:name="Grid Table 3 Accent 1" w:uiPriority="48"/>
+    <w:lsdException w:name="Grid Table 4 Accent 1" w:uiPriority="49"/>
+    <w:lsdException w:name="Grid Table 5 Dark Accent 1" w:uiPriority="50"/>
+    <w:lsdException w:name="Grid Table 6 Colorful Accent 1" w:uiPriority="51"/>
+    <w:lsdException w:name="Grid Table 7 Colorful Accent 1" w:uiPriority="52"/>
+    <w:lsdException w:name="Grid Table 1 Light Accent 2" w:uiPriority="46"/>
+    <w:lsdException w:name="Grid Table 2 Accent 2" w:uiPriority="47"/>
+    <w:lsdException w:name="Grid Table 3 Accent 2" w:uiPriority="48"/>
+    <w:lsdException w:name="Grid Table 4 Accent 2" w:uiPriority="49"/>
+    <w:lsdException w:name="Grid Table 5 Dark Accent 2" w:uiPriority="50"/>
+    <w:lsdException w:name="Grid Table 6 Colorful Accent 2" w:uiPriority="51"/>
+    <w:lsdException w:name="Grid Table 7 Colorful Accent 2" w:uiPriority="52"/>
+    <w:lsdException w:name="Grid Table 1 Light Accent 3" w:uiPriority="46"/>
+    <w:lsdException w:name="Grid Table 2 Accent 3" w:uiPriority="47"/>
+    <w:lsdException w:name="Grid Table 3 Accent 3" w:uiPriority="48"/>
+    <w:lsdException w:name="Grid Table 4 Accent 3" w:uiPriority="49"/>
+    <w:lsdException w:name="Grid Table 5 Dark Accent 3" w:uiPriority="50"/>
+    <w:lsdException w:name="Grid Table 6 Colorful Accent 3" w:uiPriority="51"/>
+    <w:lsdException w:name="Grid Table 7 Colorful Accent 3" w:uiPriority="52"/>
+    <w:lsdException w:name="Grid Table 1 Light Accent 4" w:uiPriority="46"/>
+    <w:lsdException w:name="Grid Table 2 Accent 4" w:uiPriority="47"/>
+    <w:lsdException w:name="Grid Table 3 Accent 4" w:uiPriority="48"/>
+    <w:lsdException w:name="Grid Table 4 Accent 4" w:uiPriority="49"/>
+    <w:lsdException w:name="Grid Table 5 Dark Accent 4" w:uiPriority="50"/>
+    <w:lsdException w:name="Grid Table 6 Colorful Accent 4" w:uiPriority="51"/>
+    <w:lsdException w:name="Grid Table 7 Colorful Accent 4" w:uiPriority="52"/>
+    <w:lsdException w:name="Grid Table 1 Light Accent 5" w:uiPriority="46"/>
+    <w:lsdException w:name="Grid Table 2 Accent 5" w:uiPriority="47"/>
+    <w:lsdException w:name="Grid Table 3 Accent 5" w:uiPriority="48"/>
+    <w:lsdException w:name="Grid Table 4 Accent 5" w:uiPriority="49"/>
+    <w:lsdException w:name="Grid Table 5 Dark Accent 5" w:uiPriority="50"/>
+    <w:lsdException w:name="Grid Table 6 Colorful Accent 5" w:uiPriority="51"/>
+    <w:lsdException w:name="Grid Table 7 Colorful Accent 5" w:uiPriority="52"/>
+    <w:lsdException w:name="Grid Table 1 Light Accent 6" w:uiPriority="46"/>
+    <w:lsdException w:name="Grid Table 2 Accent 6" w:uiPriority="47"/>
+    <w:lsdException w:name="Grid Table 3 Accent 6" w:uiPriority="48"/>
+    <w:lsdException w:name="Grid Table 4 Accent 6" w:uiPriority="49"/>
+    <w:lsdException w:name="Grid Table 5 Dark Accent 6" w:uiPriority="50"/>
+    <w:lsdException w:name="Grid Table 6 Colorful Accent 6" w:uiPriority="51"/>
+    <w:lsdException w:name="Grid Table 7 Colorful Accent 6" w:uiPriority="52"/>
+    <w:lsdException w:name="List Table 1 Light" w:uiPriority="46"/>
+    <w:lsdException w:name="List Table 2" w:uiPriority="47"/>
+    <w:lsdException w:name="List Table 3" w:uiPriority="48"/>
+    <w:lsdException w:name="List Table 4" w:uiPriority="49"/>
+    <w:lsdException w:name="List Table 5 Dark" w:uiPriority="50"/>
+    <w:lsdException w:name="List Table 6 Colorful" w:uiPriority="51"/>
+    <w:lsdException w:name="List Table 7 Colorful" w:uiPriority="52"/>
+    <w:lsdException w:name="List Table 1 Light Accent 1" w:uiPriority="46"/>
+    <w:lsdException w:name="List Table 2 Accent 1" w:uiPriority="47"/>
+    <w:lsdException w:name="List Table 3 Accent 1" w:uiPriority="48"/>
+    <w:lsdException w:name="List Table 4 Accent 1" w:uiPriority="49"/>
+    <w:lsdException w:name="List Table 5 Dark Accent 1" w:uiPriority="50"/>
+    <w:lsdException w:name="List Table 6 Colorful Accent 1" w:uiPriority="51"/>
+    <w:lsdException w:name="List Table 7 Colorful Accent 1" w:uiPriority="52"/>
+    <w:lsdException w:name="List Table 1 Light Accent 2" w:uiPriority="46"/>
+    <w:lsdException w:name="List Table 2 Accent 2" w:uiPriority="47"/>
+    <w:lsdException w:name="List Table 3 Accent 2" w:uiPriority="48"/>
+    <w:lsdException w:name="List Table 4 Accent 2" w:uiPriority="49"/>
+    <w:lsdException w:name="List Table 5 Dark Accent 2" w:uiPriority="50"/>
+    <w:lsdException w:name="List Table 6 Colorful Accent 2" w:uiPriority="51"/>
+    <w:lsdException w:name="List Table 7 Colorful Accent 2" w:uiPriority="52"/>
+    <w:lsdException w:name="List Table 1 Light Accent 3" w:uiPriority="46"/>
+    <w:lsdException w:name="List Table 2 Accent 3" w:uiPriority="47"/>
+    <w:lsdException w:name="List Table 3 Accent 3" w:uiPriority="48"/>
+    <w:lsdException w:name="List Table 4 Accent 3" w:uiPriority="49"/>
+    <w:lsdException w:name="List Table 5 Dark Accent 3" w:uiPriority="50"/>
+    <w:lsdException w:name="List Table 6 Colorful Accent 3" w:uiPriority="51"/>
+    <w:lsdException w:name="List Table 7 Colorful Accent 3" w:uiPriority="52"/>
+    <w:lsdException w:name="List Table 1 Light Accent 4" w:uiPriority="46"/>
+    <w:lsdException w:name="List Table 2 Accent 4" w:uiPriority="47"/>
+    <w:lsdException w:name="List Table 3 Accent 4" w:uiPriority="48"/>
+    <w:lsdException w:name="List Table 4 Accent 4" w:uiPriority="49"/>
+    <w:lsdException w:name="List Table 5 Dark Accent 4" w:uiPriority="50"/>
+    <w:lsdException w:name="List Table 6 Colorful Accent 4" w:uiPriority="51"/>
+    <w:lsdException w:name="List Table 7 Colorful Accent 4" w:uiPriority="52"/>
+    <w:lsdException w:name="List Table 1 Light Accent 5" w:uiPriority="46"/>
+    <w:lsdException w:name="List Table 2 Accent 5" w:uiPriority="47"/>
+    <w:lsdException w:name="List Table 3 Accent 5" w:uiPriority="48"/>
+    <w:lsdException w:name="List Table 4 Accent 5" w:uiPriority="49"/>
+    <w:lsdException w:name="List Table 5 Dark Accent 5" w:uiPriority="50"/>
+    <w:lsdException w:name="List Table 6 Colorful Accent 5" w:uiPriority="51"/>
+    <w:lsdException w:name="List Table 7 Colorful Accent 5" w:uiPriority="52"/>
+    <w:lsdException w:name="List Table 1 Light Accent 6" w:uiPriority="46"/>
+    <w:lsdException w:name="List Table 2 Accent 6" w:uiPriority="47"/>
+    <w:lsdException w:name="List Table 3 Accent 6" w:uiPriority="48"/>
+    <w:lsdException w:name="List Table 4 Accent 6" w:uiPriority="49"/>
+    <w:lsdException w:name="List Table 5 Dark Accent 6" w:uiPriority="50"/>
+    <w:lsdException w:name="List Table 6 Colorful Accent 6" w:uiPriority="51"/>
+    <w:lsdException w:name="List Table 7 Colorful Accent 6" w:uiPriority="52"/>
+    <w:lsdException w:name="Mention" w:semiHidden="1" w:unhideWhenUsed="1"/>
+    <w:lsdException w:name="Smart Hyperlink" w:semiHidden="1" w:unhideWhenUsed="1"/>
+    <w:lsdException w:name="Hashtag" w:semiHidden="1" w:unhideWhenUsed="1"/>
+    <w:lsdException w:name="Unresolved Mention" w:semiHidden="1" w:unhideWhenUsed="1"/>
+    <w:lsdException w:name="Smart Link" w:semiHidden="1" w:unhideWhenUsed="1"/>
+  </w:latentStyles>
+  <w:style w:type="paragraph" w:default="1" w:styleId="Normal">
+    <w:name w:val="Normal"/>
     <w:qFormat/>
-    <w:rPr>
-      <w:sz w:val="56"/>
-      <w:szCs w:val="56"/>
-    </w:rPr>
   </w:style>
   <w:style w:type="paragraph" w:styleId="Heading1">
-    <w:name w:val="Heading 1"/>
-    <w:basedOn w:val="Normal"/>
-    <w:next w:val="Normal"/>
+    <w:name w:val="heading 1"/>
+    <w:uiPriority w:val="9"/>
     <w:qFormat/>
+    <w:pPr>
+      <w:outlineLvl w:val="0"/>
+    </w:pPr>
     <w:rPr>
       <w:color w:val="2E74B5"/>
       <w:sz w:val="32"/>
@@ -1194,10 +1474,14 @@
     </w:rPr>
   </w:style>
   <w:style w:type="paragraph" w:styleId="Heading2">
-    <w:name w:val="Heading 2"/>
-    <w:basedOn w:val="Normal"/>
-    <w:next w:val="Normal"/>
+    <w:name w:val="heading 2"/>
+    <w:uiPriority w:val="9"/>
+    <w:semiHidden/>
+    <w:unhideWhenUsed/>
     <w:qFormat/>
+    <w:pPr>
+      <w:outlineLvl w:val="1"/>
+    </w:pPr>
     <w:rPr>
       <w:color w:val="2E74B5"/>
       <w:sz w:val="26"/>
@@ -1205,10 +1489,14 @@
     </w:rPr>
   </w:style>
   <w:style w:type="paragraph" w:styleId="Heading3">
-    <w:name w:val="Heading 3"/>
-    <w:basedOn w:val="Normal"/>
-    <w:next w:val="Normal"/>
+    <w:name w:val="heading 3"/>
+    <w:uiPriority w:val="9"/>
+    <w:semiHidden/>
+    <w:unhideWhenUsed/>
     <w:qFormat/>
+    <w:pPr>
+      <w:outlineLvl w:val="2"/>
+    </w:pPr>
     <w:rPr>
       <w:color w:val="1F4D78"/>
       <w:sz w:val="24"/>
@@ -1216,10 +1504,14 @@
     </w:rPr>
   </w:style>
   <w:style w:type="paragraph" w:styleId="Heading4">
-    <w:name w:val="Heading 4"/>
-    <w:basedOn w:val="Normal"/>
-    <w:next w:val="Normal"/>
+    <w:name w:val="heading 4"/>
+    <w:uiPriority w:val="9"/>
+    <w:semiHidden/>
+    <w:unhideWhenUsed/>
     <w:qFormat/>
+    <w:pPr>
+      <w:outlineLvl w:val="3"/>
+    </w:pPr>
     <w:rPr>
       <w:i/>
       <w:iCs/>
@@ -1227,27 +1519,69 @@
     </w:rPr>
   </w:style>
   <w:style w:type="paragraph" w:styleId="Heading5">
-    <w:name w:val="Heading 5"/>
-    <w:basedOn w:val="Normal"/>
-    <w:next w:val="Normal"/>
+    <w:name w:val="heading 5"/>
+    <w:uiPriority w:val="9"/>
+    <w:semiHidden/>
+    <w:unhideWhenUsed/>
     <w:qFormat/>
+    <w:pPr>
+      <w:outlineLvl w:val="4"/>
+    </w:pPr>
     <w:rPr>
       <w:color w:val="2E74B5"/>
     </w:rPr>
   </w:style>
   <w:style w:type="paragraph" w:styleId="Heading6">
-    <w:name w:val="Heading 6"/>
-    <w:basedOn w:val="Normal"/>
-    <w:next w:val="Normal"/>
+    <w:name w:val="heading 6"/>
+    <w:uiPriority w:val="9"/>
+    <w:semiHidden/>
+    <w:unhideWhenUsed/>
     <w:qFormat/>
+    <w:pPr>
+      <w:outlineLvl w:val="5"/>
+    </w:pPr>
     <w:rPr>
       <w:color w:val="1F4D78"/>
     </w:rPr>
   </w:style>
-  <w:style w:type="paragraph" w:styleId="Strong">
-    <w:name w:val="Strong"/>
-    <w:basedOn w:val="Normal"/>
-    <w:next w:val="Normal"/>
+  <w:style w:type="character" w:default="1" w:styleId="DefaultParagraphFont">
+    <w:name w:val="Default Paragraph Font"/>
+    <w:uiPriority w:val="1"/>
+    <w:semiHidden/>
+    <w:unhideWhenUsed/>
+  </w:style>
+  <w:style w:type="table" w:default="1" w:styleId="TableNormal">
+    <w:name w:val="Normal Table"/>
+    <w:uiPriority w:val="99"/>
+    <w:semiHidden/>
+    <w:unhideWhenUsed/>
+    <w:tblPr>
+      <w:tblInd w:w="0" w:type="dxa"/>
+      <w:tblCellMar>
+        <w:top w:w="0" w:type="dxa"/>
+        <w:left w:w="108" w:type="dxa"/>
+        <w:bottom w:w="0" w:type="dxa"/>
+        <w:right w:w="108" w:type="dxa"/>
+      </w:tblCellMar>
+    </w:tblPr>
+  </w:style>
+  <w:style w:type="numbering" w:default="1" w:styleId="NoList">
+    <w:name w:val="No List"/>
+    <w:uiPriority w:val="99"/>
+    <w:semiHidden/>
+    <w:unhideWhenUsed/>
+  </w:style>
+  <w:style w:type="paragraph" w:styleId="Title">
+    <w:name w:val="Title"/>
+    <w:uiPriority w:val="10"/>
+    <w:qFormat/>
+    <w:rPr>
+      <w:sz w:val="56"/>
+      <w:szCs w:val="56"/>
+    </w:rPr>
+  </w:style>
+  <w:style w:type="paragraph" w:customStyle="1" w:styleId="Strong1">
+    <w:name w:val="Strong1"/>
     <w:qFormat/>
     <w:rPr>
       <w:b/>
@@ -1256,12 +1590,10 @@
   </w:style>
   <w:style w:type="paragraph" w:styleId="ListParagraph">
     <w:name w:val="List Paragraph"/>
-    <w:basedOn w:val="Normal"/>
     <w:qFormat/>
   </w:style>
   <w:style w:type="character" w:styleId="Hyperlink">
     <w:name w:val="Hyperlink"/>
-    <w:basedOn w:val="DefaultParagraphFont"/>
     <w:uiPriority w:val="99"/>
     <w:unhideWhenUsed/>
     <w:rPr>
@@ -1271,7 +1603,6 @@
   </w:style>
   <w:style w:type="character" w:styleId="FootnoteReference">
     <w:name w:val="footnote reference"/>
-    <w:basedOn w:val="DefaultParagraphFont"/>
     <w:uiPriority w:val="99"/>
     <w:semiHidden/>
     <w:unhideWhenUsed/>
@@ -1281,22 +1612,17 @@
   </w:style>
   <w:style w:type="paragraph" w:styleId="FootnoteText">
     <w:name w:val="footnote text"/>
-    <w:basedOn w:val="Normal"/>
     <w:link w:val="FootnoteTextChar"/>
     <w:uiPriority w:val="99"/>
     <w:semiHidden/>
     <w:unhideWhenUsed/>
-    <w:pPr>
-      <w:spacing w:after="0" w:line="240" w:lineRule="auto"/>
-    </w:pPr>
     <w:rPr>
       <w:sz w:val="20"/>
       <w:szCs w:val="20"/>
     </w:rPr>
   </w:style>
-  <w:style w:type="character" w:styleId="FootnoteTextChar">
+  <w:style w:type="character" w:customStyle="1" w:styleId="FootnoteTextChar">
     <w:name w:val="Footnote Text Char"/>
-    <w:basedOn w:val="DefaultParagraphFont"/>
     <w:link w:val="FootnoteText"/>
     <w:uiPriority w:val="99"/>
     <w:semiHidden/>
@@ -1308,7 +1634,6 @@
   </w:style>
   <w:style w:type="character" w:styleId="EndnoteReference">
     <w:name w:val="endnote reference"/>
-    <w:basedOn w:val="DefaultParagraphFont"/>
     <w:uiPriority w:val="99"/>
     <w:semiHidden/>
     <w:unhideWhenUsed/>
@@ -1318,22 +1643,17 @@
   </w:style>
   <w:style w:type="paragraph" w:styleId="EndnoteText">
     <w:name w:val="endnote text"/>
-    <w:basedOn w:val="Normal"/>
     <w:link w:val="EndnoteTextChar"/>
     <w:uiPriority w:val="99"/>
     <w:semiHidden/>
     <w:unhideWhenUsed/>
-    <w:pPr>
-      <w:spacing w:after="0" w:line="240" w:lineRule="auto"/>
-    </w:pPr>
     <w:rPr>
       <w:sz w:val="20"/>
       <w:szCs w:val="20"/>
     </w:rPr>
   </w:style>
-  <w:style w:type="character" w:styleId="EndnoteTextChar">
+  <w:style w:type="character" w:customStyle="1" w:styleId="EndnoteTextChar">
     <w:name w:val="Endnote Text Char"/>
-    <w:basedOn w:val="DefaultParagraphFont"/>
     <w:link w:val="EndnoteText"/>
     <w:uiPriority w:val="99"/>
     <w:semiHidden/>
@@ -1344,4 +1664,319 @@
     </w:rPr>
   </w:style>
 </w:styles>
+</file>
+
+<file path=word/theme/theme1.xml><?xml version="1.0" encoding="utf-8"?>
+<a:theme xmlns:a="http://schemas.openxmlformats.org/drawingml/2006/main" name="Office Theme">
+  <a:themeElements>
+    <a:clrScheme name="Office">
+      <a:dk1>
+        <a:sysClr val="windowText" lastClr="000000"/>
+      </a:dk1>
+      <a:lt1>
+        <a:sysClr val="window" lastClr="FFFFFF"/>
+      </a:lt1>
+      <a:dk2>
+        <a:srgbClr val="0E2841"/>
+      </a:dk2>
+      <a:lt2>
+        <a:srgbClr val="E8E8E8"/>
+      </a:lt2>
+      <a:accent1>
+        <a:srgbClr val="156082"/>
+      </a:accent1>
+      <a:accent2>
+        <a:srgbClr val="E97132"/>
+      </a:accent2>
+      <a:accent3>
+        <a:srgbClr val="196B24"/>
+      </a:accent3>
+      <a:accent4>
+        <a:srgbClr val="0F9ED5"/>
+      </a:accent4>
+      <a:accent5>
+        <a:srgbClr val="A02B93"/>
+      </a:accent5>
+      <a:accent6>
+        <a:srgbClr val="4EA72E"/>
+      </a:accent6>
+      <a:hlink>
+        <a:srgbClr val="467886"/>
+      </a:hlink>
+      <a:folHlink>
+        <a:srgbClr val="96607D"/>
+      </a:folHlink>
+    </a:clrScheme>
+    <a:fontScheme name="Office">
+      <a:majorFont>
+        <a:latin typeface="Aptos Display" panose="02110004020202020204"/>
+        <a:ea typeface=""/>
+        <a:cs typeface=""/>
+        <a:font script="Jpan" typeface="游ゴシック Light"/>
+        <a:font script="Hang" typeface="맑은 고딕"/>
+        <a:font script="Hans" typeface="等线 Light"/>
+        <a:font script="Hant" typeface="新細明體"/>
+        <a:font script="Arab" typeface="Times New Roman"/>
+        <a:font script="Hebr" typeface="Times New Roman"/>
+        <a:font script="Thai" typeface="Angsana New"/>
+        <a:font script="Ethi" typeface="Nyala"/>
+        <a:font script="Beng" typeface="Vrinda"/>
+        <a:font script="Gujr" typeface="Shruti"/>
+        <a:font script="Khmr" typeface="MoolBoran"/>
+        <a:font script="Knda" typeface="Tunga"/>
+        <a:font script="Guru" typeface="Raavi"/>
+        <a:font script="Cans" typeface="Euphemia"/>
+        <a:font script="Cher" typeface="Plantagenet Cherokee"/>
+        <a:font script="Yiii" typeface="Microsoft Yi Baiti"/>
+        <a:font script="Tibt" typeface="Microsoft Himalaya"/>
+        <a:font script="Thaa" typeface="MV Boli"/>
+        <a:font script="Deva" typeface="Mangal"/>
+        <a:font script="Telu" typeface="Gautami"/>
+        <a:font script="Taml" typeface="Latha"/>
+        <a:font script="Syrc" typeface="Estrangelo Edessa"/>
+        <a:font script="Orya" typeface="Kalinga"/>
+        <a:font script="Mlym" typeface="Kartika"/>
+        <a:font script="Laoo" typeface="DokChampa"/>
+        <a:font script="Sinh" typeface="Iskoola Pota"/>
+        <a:font script="Mong" typeface="Mongolian Baiti"/>
+        <a:font script="Viet" typeface="Times New Roman"/>
+        <a:font script="Uigh" typeface="Microsoft Uighur"/>
+        <a:font script="Geor" typeface="Sylfaen"/>
+        <a:font script="Armn" typeface="Arial"/>
+        <a:font script="Bugi" typeface="Leelawadee UI"/>
+        <a:font script="Bopo" typeface="Microsoft JhengHei"/>
+        <a:font script="Java" typeface="Javanese Text"/>
+        <a:font script="Lisu" typeface="Segoe UI"/>
+        <a:font script="Mymr" typeface="Myanmar Text"/>
+        <a:font script="Nkoo" typeface="Ebrima"/>
+        <a:font script="Olck" typeface="Nirmala UI"/>
+        <a:font script="Osma" typeface="Ebrima"/>
+        <a:font script="Phag" typeface="Phagspa"/>
+        <a:font script="Syrn" typeface="Estrangelo Edessa"/>
+        <a:font script="Syrj" typeface="Estrangelo Edessa"/>
+        <a:font script="Syre" typeface="Estrangelo Edessa"/>
+        <a:font script="Sora" typeface="Nirmala UI"/>
+        <a:font script="Tale" typeface="Microsoft Tai Le"/>
+        <a:font script="Talu" typeface="Microsoft New Tai Lue"/>
+        <a:font script="Tfng" typeface="Ebrima"/>
+      </a:majorFont>
+      <a:minorFont>
+        <a:latin typeface="Aptos" panose="02110004020202020204"/>
+        <a:ea typeface=""/>
+        <a:cs typeface=""/>
+        <a:font script="Jpan" typeface="游明朝"/>
+        <a:font script="Hang" typeface="맑은 고딕"/>
+        <a:font script="Hans" typeface="等线"/>
+        <a:font script="Hant" typeface="新細明體"/>
+        <a:font script="Arab" typeface="Arial"/>
+        <a:font script="Hebr" typeface="Arial"/>
+        <a:font script="Thai" typeface="Cordia New"/>
+        <a:font script="Ethi" typeface="Nyala"/>
+        <a:font script="Beng" typeface="Vrinda"/>
+        <a:font script="Gujr" typeface="Shruti"/>
+        <a:font script="Khmr" typeface="DaunPenh"/>
+        <a:font script="Knda" typeface="Tunga"/>
+        <a:font script="Guru" typeface="Raavi"/>
+        <a:font script="Cans" typeface="Euphemia"/>
+        <a:font script="Cher" typeface="Plantagenet Cherokee"/>
+        <a:font script="Yiii" typeface="Microsoft Yi Baiti"/>
+        <a:font script="Tibt" typeface="Microsoft Himalaya"/>
+        <a:font script="Thaa" typeface="MV Boli"/>
+        <a:font script="Deva" typeface="Mangal"/>
+        <a:font script="Telu" typeface="Gautami"/>
+        <a:font script="Taml" typeface="Latha"/>
+        <a:font script="Syrc" typeface="Estrangelo Edessa"/>
+        <a:font script="Orya" typeface="Kalinga"/>
+        <a:font script="Mlym" typeface="Kartika"/>
+        <a:font script="Laoo" typeface="DokChampa"/>
+        <a:font script="Sinh" typeface="Iskoola Pota"/>
+        <a:font script="Mong" typeface="Mongolian Baiti"/>
+        <a:font script="Viet" typeface="Arial"/>
+        <a:font script="Uigh" typeface="Microsoft Uighur"/>
+        <a:font script="Geor" typeface="Sylfaen"/>
+        <a:font script="Armn" typeface="Arial"/>
+        <a:font script="Bugi" typeface="Leelawadee UI"/>
+        <a:font script="Bopo" typeface="Microsoft JhengHei"/>
+        <a:font script="Java" typeface="Javanese Text"/>
+        <a:font script="Lisu" typeface="Segoe UI"/>
+        <a:font script="Mymr" typeface="Myanmar Text"/>
+        <a:font script="Nkoo" typeface="Ebrima"/>
+        <a:font script="Olck" typeface="Nirmala UI"/>
+        <a:font script="Osma" typeface="Ebrima"/>
+        <a:font script="Phag" typeface="Phagspa"/>
+        <a:font script="Syrn" typeface="Estrangelo Edessa"/>
+        <a:font script="Syrj" typeface="Estrangelo Edessa"/>
+        <a:font script="Syre" typeface="Estrangelo Edessa"/>
+        <a:font script="Sora" typeface="Nirmala UI"/>
+        <a:font script="Tale" typeface="Microsoft Tai Le"/>
+        <a:font script="Talu" typeface="Microsoft New Tai Lue"/>
+        <a:font script="Tfng" typeface="Ebrima"/>
+      </a:minorFont>
+    </a:fontScheme>
+    <a:fmtScheme name="Office">
+      <a:fillStyleLst>
+        <a:solidFill>
+          <a:schemeClr val="phClr"/>
+        </a:solidFill>
+        <a:gradFill rotWithShape="1">
+          <a:gsLst>
+            <a:gs pos="0">
+              <a:schemeClr val="phClr">
+                <a:lumMod val="110000"/>
+                <a:satMod val="105000"/>
+                <a:tint val="67000"/>
+              </a:schemeClr>
+            </a:gs>
+            <a:gs pos="50000">
+              <a:schemeClr val="phClr">
+                <a:lumMod val="105000"/>
+                <a:satMod val="103000"/>
+                <a:tint val="73000"/>
+              </a:schemeClr>
+            </a:gs>
+            <a:gs pos="100000">
+              <a:schemeClr val="phClr">
+                <a:lumMod val="105000"/>
+                <a:satMod val="109000"/>
+                <a:tint val="81000"/>
+              </a:schemeClr>
+            </a:gs>
+          </a:gsLst>
+          <a:lin ang="5400000" scaled="0"/>
+        </a:gradFill>
+        <a:gradFill rotWithShape="1">
+          <a:gsLst>
+            <a:gs pos="0">
+              <a:schemeClr val="phClr">
+                <a:satMod val="103000"/>
+                <a:lumMod val="102000"/>
+                <a:tint val="94000"/>
+              </a:schemeClr>
+            </a:gs>
+            <a:gs pos="50000">
+              <a:schemeClr val="phClr">
+                <a:satMod val="110000"/>
+                <a:lumMod val="100000"/>
+                <a:shade val="100000"/>
+              </a:schemeClr>
+            </a:gs>
+            <a:gs pos="100000">
+              <a:schemeClr val="phClr">
+                <a:lumMod val="99000"/>
+                <a:satMod val="120000"/>
+                <a:shade val="78000"/>
+              </a:schemeClr>
+            </a:gs>
+          </a:gsLst>
+          <a:lin ang="5400000" scaled="0"/>
+        </a:gradFill>
+      </a:fillStyleLst>
+      <a:lnStyleLst>
+        <a:ln w="12700" cap="flat" cmpd="sng" algn="ctr">
+          <a:solidFill>
+            <a:schemeClr val="phClr"/>
+          </a:solidFill>
+          <a:prstDash val="solid"/>
+          <a:miter lim="800000"/>
+        </a:ln>
+        <a:ln w="19050" cap="flat" cmpd="sng" algn="ctr">
+          <a:solidFill>
+            <a:schemeClr val="phClr"/>
+          </a:solidFill>
+          <a:prstDash val="solid"/>
+          <a:miter lim="800000"/>
+        </a:ln>
+        <a:ln w="25400" cap="flat" cmpd="sng" algn="ctr">
+          <a:solidFill>
+            <a:schemeClr val="phClr"/>
+          </a:solidFill>
+          <a:prstDash val="solid"/>
+          <a:miter lim="800000"/>
+        </a:ln>
+      </a:lnStyleLst>
+      <a:effectStyleLst>
+        <a:effectStyle>
+          <a:effectLst/>
+        </a:effectStyle>
+        <a:effectStyle>
+          <a:effectLst/>
+        </a:effectStyle>
+        <a:effectStyle>
+          <a:effectLst>
+            <a:outerShdw blurRad="57150" dist="19050" dir="5400000" algn="ctr" rotWithShape="0">
+              <a:srgbClr val="000000">
+                <a:alpha val="63000"/>
+              </a:srgbClr>
+            </a:outerShdw>
+          </a:effectLst>
+        </a:effectStyle>
+      </a:effectStyleLst>
+      <a:bgFillStyleLst>
+        <a:solidFill>
+          <a:schemeClr val="phClr"/>
+        </a:solidFill>
+        <a:solidFill>
+          <a:schemeClr val="phClr">
+            <a:tint val="95000"/>
+            <a:satMod val="170000"/>
+          </a:schemeClr>
+        </a:solidFill>
+        <a:gradFill rotWithShape="1">
+          <a:gsLst>
+            <a:gs pos="0">
+              <a:schemeClr val="phClr">
+                <a:tint val="93000"/>
+                <a:satMod val="150000"/>
+                <a:shade val="98000"/>
+                <a:lumMod val="102000"/>
+              </a:schemeClr>
+            </a:gs>
+            <a:gs pos="50000">
+              <a:schemeClr val="phClr">
+                <a:tint val="98000"/>
+                <a:satMod val="130000"/>
+                <a:shade val="90000"/>
+                <a:lumMod val="103000"/>
+              </a:schemeClr>
+            </a:gs>
+            <a:gs pos="100000">
+              <a:schemeClr val="phClr">
+                <a:shade val="63000"/>
+                <a:satMod val="120000"/>
+              </a:schemeClr>
+            </a:gs>
+          </a:gsLst>
+          <a:lin ang="5400000" scaled="0"/>
+        </a:gradFill>
+      </a:bgFillStyleLst>
+    </a:fmtScheme>
+  </a:themeElements>
+  <a:objectDefaults>
+    <a:lnDef>
+      <a:spPr/>
+      <a:bodyPr/>
+      <a:lstStyle/>
+      <a:style>
+        <a:lnRef idx="2">
+          <a:schemeClr val="accent1"/>
+        </a:lnRef>
+        <a:fillRef idx="0">
+          <a:schemeClr val="accent1"/>
+        </a:fillRef>
+        <a:effectRef idx="1">
+          <a:schemeClr val="accent1"/>
+        </a:effectRef>
+        <a:fontRef idx="minor">
+          <a:schemeClr val="tx1"/>
+        </a:fontRef>
+      </a:style>
+    </a:lnDef>
+  </a:objectDefaults>
+  <a:extraClrSchemeLst/>
+  <a:extLst>
+    <a:ext uri="{05A4C25C-085E-4340-85A3-A5531E510DB2}">
+      <thm15:themeFamily xmlns:thm15="http://schemas.microsoft.com/office/thememl/2012/main" name="Office Theme" id="{2E142A2C-CD16-42D6-873A-C26D2A0506FA}" vid="{1BDDFF52-6CD6-40A5-AB3C-68EB2F1E4D0A}"/>
+    </a:ext>
+  </a:extLst>
+</a:theme>
 </file>
</xml_diff>